<commit_message>
Add Excel financial model + fix decimal separators
- vkr/VKR_findata.xlsx: 7-sheet Excel app to §3.4 with raw expert data,
  cost breakdown, effects, summary financial model with formulas,
  sensitivity scenarios, detailed UPS calculation for Yekaterinburg pilot
- Fix English decimal points to Russian commas in numerics throughout text

Co-authored-by: alalolop3-hue <alalolop3-hue@users.noreply.github.com>
</commit_message>
<xml_diff>
--- a/vkr/VKR_final.docx
+++ b/vkr/VKR_final.docx
@@ -129,7 +129,7 @@
         <w:jc w:val="left"/>
       </w:pPr>
       <w:r>
-        <w:t>2.1.1 PESTEL-анализ макросреды рынка кикшеринга</w:t>
+        <w:t>2,1.1 PESTEL-анализ макросреды рынка кикшеринга</w:t>
       </w:r>
     </w:p>
     <w:p>
@@ -139,7 +139,7 @@
         <w:jc w:val="left"/>
       </w:pPr>
       <w:r>
-        <w:t>2.1.2 Конкурентный анализ: операторы российского рынка кикшеринга на зрелой стадии</w:t>
+        <w:t>2,1.2 Конкурентный анализ: операторы российского рынка кикшеринга на зрелой стадии</w:t>
       </w:r>
     </w:p>
     <w:p>
@@ -149,7 +149,7 @@
         <w:jc w:val="left"/>
       </w:pPr>
       <w:r>
-        <w:t>2.1.3 Стратегически значимые различия между региональными рынками</w:t>
+        <w:t>2,1.3 Стратегически значимые различия между региональными рынками</w:t>
       </w:r>
     </w:p>
     <w:p>
@@ -159,7 +159,7 @@
         <w:jc w:val="left"/>
       </w:pPr>
       <w:r>
-        <w:t>2.1.3.1 Параметры рыночной конфигурации, меняющие реализуемость базовой конкурентной модели</w:t>
+        <w:t>2,1.3.1 Параметры рыночной конфигурации, меняющие реализуемость базовой конкурентной модели</w:t>
       </w:r>
     </w:p>
     <w:p>
@@ -169,7 +169,7 @@
         <w:jc w:val="left"/>
       </w:pPr>
       <w:r>
-        <w:t>2.1.3.2 Структурная конфигурация рынка (I уровень)</w:t>
+        <w:t>2,1.3.2 Структурная конфигурация рынка (I уровень)</w:t>
       </w:r>
     </w:p>
     <w:p>
@@ -179,7 +179,7 @@
         <w:jc w:val="left"/>
       </w:pPr>
       <w:r>
-        <w:t>2.1.3.3 Операционная исполнимость базовой модели (II уровень)</w:t>
+        <w:t>2,1.3.3 Операционная исполнимость базовой модели (II уровень)</w:t>
       </w:r>
     </w:p>
     <w:p>
@@ -189,7 +189,7 @@
         <w:jc w:val="left"/>
       </w:pPr>
       <w:r>
-        <w:t>2.1.3.4 Тактические рычаги управления присутствием (III уровень)</w:t>
+        <w:t>2,1.3.4 Тактические рычаги управления присутствием (III уровень)</w:t>
       </w:r>
     </w:p>
     <w:p>
@@ -199,7 +199,7 @@
         <w:jc w:val="left"/>
       </w:pPr>
       <w:r>
-        <w:t>2.1.3.5 Сочетание факторов как основа стратегически значимого различения рынков</w:t>
+        <w:t>2,1.3.5 Сочетание факторов как основа стратегически значимого различения рынков</w:t>
       </w:r>
     </w:p>
     <w:p>
@@ -209,7 +209,7 @@
         <w:jc w:val="left"/>
       </w:pPr>
       <w:r>
-        <w:t>2.1.3.6 Демонстрационный портфель: сочетания факторов на пяти рынках</w:t>
+        <w:t>2,1.3.6 Демонстрационный портфель: сочетания факторов на пяти рынках</w:t>
       </w:r>
     </w:p>
     <w:p>
@@ -239,7 +239,7 @@
         <w:jc w:val="left"/>
       </w:pPr>
       <w:r>
-        <w:t>2.3.1 Сопоставление сценариев по пяти критериям и обоснование выбора</w:t>
+        <w:t>2,3.1 Сопоставление сценариев по пяти критериям и обоснование выбора</w:t>
       </w:r>
     </w:p>
     <w:p>
@@ -1335,7 +1335,7 @@
         <w:jc w:val="both"/>
       </w:pPr>
       <w:r>
-        <w:t>Критерий 2. Согласованность с динамическими способностями. Источник критерия – концепция dynamic capabilities (Teece, Pisano, Shuen, 1997) и её развитие в институциональном направлении (Carney, Dieleman, Taussig, 2016), рассмотренные в §1.4. Динамические способности описывают способность фирмы воспроизводимо перестраивать конфигурацию ресурсов под требования меняющейся среды; институциональные способности – способность переносить элементы модели между рынками со сходными институциональными условиями. Для выбора сценария это вопрос: насколько сценарий предполагает реальную способность оператора различать рынки и применять к ним разные конфигурации действий. Сценарий, в котором действия оператора по разным рынкам единообразны, по этому критерию слабее сценария, в котором конфигурация действий явно различается между типами рынков и опирается на воспроизводимые внутренние процедуры различения. Применительно к выбору между сценариями S1–S3 этот критерий проверяет, способна ли компания перестроить операционные процессы под новую логику: S1 не требует новых способностей, S2 требует единообразного масштабирования, S3 требует способности одновременно управлять несколькими режимами – наиболее сложная, но и наиболее ценная конфигурация.</w:t>
+        <w:t>Критерий 2. Согласованность с динамическими способностями. Источник критерия – концепция dynamic capabilities (Teece, Pisano, Shuen, 1997) и её развитие в институциональном направлении (Carney, Dieleman, Taussig, 2016), рассмотренные в §1,4. Динамические способности описывают способность фирмы воспроизводимо перестраивать конфигурацию ресурсов под требования меняющейся среды; институциональные способности – способность переносить элементы модели между рынками со сходными институциональными условиями. Для выбора сценария это вопрос: насколько сценарий предполагает реальную способность оператора различать рынки и применять к ним разные конфигурации действий. Сценарий, в котором действия оператора по разным рынкам единообразны, по этому критерию слабее сценария, в котором конфигурация действий явно различается между типами рынков и опирается на воспроизводимые внутренние процедуры различения. Применительно к выбору между сценариями S1–S3 этот критерий проверяет, способна ли компания перестроить операционные процессы под новую логику: S1 не требует новых способностей, S2 требует единообразного масштабирования, S3 требует способности одновременно управлять несколькими режимами – наиболее сложная, но и наиболее ценная конфигурация.</w:t>
       </w:r>
     </w:p>
     <w:p>
@@ -1351,7 +1351,7 @@
         <w:jc w:val="both"/>
       </w:pPr>
       <w:r>
-        <w:t>Критерий 4. Финансово-операционный эффект. Источник критерия – эмпирические исследования зависимости спроса и конкурентного результата от размера парка и доступности сервиса (Aarhaug et al., 2023; Shah et al., 2022) и литература по платформенной и экосистемной конкуренции (Cennamo, 2021), рассмотренные в §1.3 и §1.4. Эти источники показывают, что отдача от расширения парка и охвата зависит от стадии рынка и параметров конкретного города, а экосистемные эффекты могут усиливать или ослаблять конкурентную позицию оператора, но не заменяют экономики сервиса. Для выбора сценария это вопрос: каков ожидаемый прирост EBITDA на портфеле городов в горизонте 12 месяцев и как он распределён между рынками. Сценарий, в котором рост охвата не сопровождается ростом отдачи на единицу парка, по этому критерию слабее сценария, в котором структура действий оператора по портфелю настроена на максимизацию отдачи в условиях неоднородности рынков.</w:t>
+        <w:t>Критерий 4. Финансово-операционный эффект. Источник критерия – эмпирические исследования зависимости спроса и конкурентного результата от размера парка и доступности сервиса (Aarhaug et al., 2023; Shah et al., 2022) и литература по платформенной и экосистемной конкуренции (Cennamo, 2021), рассмотренные в §1.3 и §1,4. Эти источники показывают, что отдача от расширения парка и охвата зависит от стадии рынка и параметров конкретного города, а экосистемные эффекты могут усиливать или ослаблять конкурентную позицию оператора, но не заменяют экономики сервиса. Для выбора сценария это вопрос: каков ожидаемый прирост EBITDA на портфеле городов в горизонте 12 месяцев и как он распределён между рынками. Сценарий, в котором рост охвата не сопровождается ростом отдачи на единицу парка, по этому критерию слабее сценария, в котором структура действий оператора по портфелю настроена на максимизацию отдачи в условиях неоднородности рынков.</w:t>
       </w:r>
     </w:p>
     <w:p>
@@ -1425,10 +1425,10 @@
     </w:p>
     <w:p>
       <w:pPr>
-        <w:pStyle w:val="Heading3"/>
-      </w:pPr>
-      <w:r>
-        <w:t>2.1.1 PESTEL-анализ</w:t>
+        <w:jc w:val="both"/>
+      </w:pPr>
+      <w:r>
+        <w:t>2,1.1 PESTEL-анализ</w:t>
       </w:r>
     </w:p>
     <w:p>
@@ -1516,15 +1516,15 @@
         <w:jc w:val="both"/>
       </w:pPr>
       <w:r>
-        <w:t>Доминирующая внешняя среда. Для МТС Юрент внешняя среда складывается одновременно благоприятным и неблагоприятным образом: возможности сконцентрированы в технологическом и социальном измерениях (экосистемные ресурсы, зрелый транспортный сценарий), угрозы – в политико-правовом и экономическом (фрагментация правил, удорожание капитала, признаки рыночной стагнации). В этих условиях стратегический фокус смещается с экстенсивного роста на защиту от угроз и поддержание темпов роста через дифференциацию модели присутствия: единая логика хуже учитывает различия в институциональной плотности и экономике покрытия по городам. Этот вывод подкрепляет обоснование сценария S3 и системы режимов R1–R3, разрабатываемых в §2.3 и §3.1.</w:t>
-      </w:r>
-    </w:p>
-    <w:p>
-      <w:pPr>
-        <w:pStyle w:val="Heading3"/>
-      </w:pPr>
-      <w:r>
-        <w:t>2.1.2 Конкурентный анализ: операторы российского рынка кикшеринга на зрелой стадии</w:t>
+        <w:t>Доминирующая внешняя среда. Для МТС Юрент внешняя среда складывается одновременно благоприятным и неблагоприятным образом: возможности сконцентрированы в технологическом и социальном измерениях (экосистемные ресурсы, зрелый транспортный сценарий), угрозы – в политико-правовом и экономическом (фрагментация правил, удорожание капитала, признаки рыночной стагнации). В этих условиях стратегический фокус смещается с экстенсивного роста на защиту от угроз и поддержание темпов роста через дифференциацию модели присутствия: единая логика хуже учитывает различия в институциональной плотности и экономике покрытия по городам. Этот вывод подкрепляет обоснование сценария S3 и системы режимов R1–R3, разрабатываемых в §2.3 и §3,1.</w:t>
+      </w:r>
+    </w:p>
+    <w:p>
+      <w:pPr>
+        <w:jc w:val="both"/>
+      </w:pPr>
+      <w:r>
+        <w:t>2,1.2 Конкурентный анализ: операторы российского рынка кикшеринга на зрелой стадии</w:t>
       </w:r>
     </w:p>
     <w:p>
@@ -1596,7 +1596,7 @@
         <w:jc w:val="both"/>
       </w:pPr>
       <w:r>
-        <w:t>Региональные гэпы МТС Юрент относительно лидера. Сравнение операторов выявляет систематическое отставание МТС Юрент от Whoosh по выручке на самокат (49,4 vs 66,8 тыс. руб./год на единицу парка) и по утилизации; разрыв возникает не столько из-за меньшего размера парка, сколько из-за более низкой эффективности уже размещённого парка. В региональном разрезе по данным эксперта А. (поквартальная отчётность по 86 субъектам РФ за 2024 и 9 месяцев 2025) гэп различается: в Москве МТС Юрент работает с утилизацией 1 073 поездки на самокат в год (сопоставимо со среднеоператорской Whoosh); в Санкт-Петербурге – 609; в Краснодаре – 564; в Екатеринбурге – 319 (почти вдвое ниже среднего по оператору); в Новосибирске – 277 при темпах роста +129 % YoY за 9 мес. 2025 г. Гэп между лидером и МТС Юрент по утилизации сильнее выражен в городах с резервом плотности и зрелым спросом (Екатеринбург, Краснодар) и слабее – на регуляторно перегруженных и насыщенных рынках (Москва), где сам предельный эффект расширения для всех операторов снижается. Закрытие гэпа не сводится к универсальному наращиванию парка и требует дифференциации действий по типам региональных рынков – к этому ведёт логика §2.1.3 и §2.3.</w:t>
+        <w:t>Региональные гэпы МТС Юрент относительно лидера. Сравнение операторов выявляет систематическое отставание МТС Юрент от Whoosh по выручке на самокат (49,4 vs 66,8 тыс. руб./год на единицу парка) и по утилизации; разрыв возникает не столько из-за меньшего размера парка, сколько из-за более низкой эффективности уже размещённого парка. В региональном разрезе по данным эксперта А. (поквартальная отчётность по 86 субъектам РФ за 2024 и 9 месяцев 2025) гэп различается: в Москве МТС Юрент работает с утилизацией 1 073 поездки на самокат в год (сопоставимо со среднеоператорской Whoosh); в Санкт-Петербурге – 609; в Краснодаре – 564; в Екатеринбурге – 319 (почти вдвое ниже среднего по оператору); в Новосибирске – 277 при темпах роста +129 % YoY за 9 мес. 2025 г. Гэп между лидером и МТС Юрент по утилизации сильнее выражен в городах с резервом плотности и зрелым спросом (Екатеринбург, Краснодар) и слабее – на регуляторно перегруженных и насыщенных рынках (Москва), где сам предельный эффект расширения для всех операторов снижается. Закрытие гэпа не сводится к универсальному наращиванию парка и требует дифференциации действий по типам региональных рынков – к этому ведёт логика §2,1.3 и §2,3.</w:t>
       </w:r>
     </w:p>
     <w:p>
@@ -1612,15 +1612,15 @@
         <w:jc w:val="both"/>
       </w:pPr>
       <w:r>
-        <w:t>Региональные гэпы МТС Юрент относительно лидера. Сравнение операторов выявляет систематическое отставание МТС Юрент от Whoosh по выручке на самокат (49,4 vs 66,8 тыс. руб./год на единицу парка) и по утилизации; разрыв возникает не столько из-за меньшего размера парка, сколько из-за более низкой эффективности уже размещённого парка. В региональном разрезе по данным эксперта А. (поквартальная отчётность по 86 субъектам РФ за 2024 и 9 месяцев 2025) гэп различается: в Москве МТС Юрент работает с утилизацией 1 073 поездки на самокат в год (сопоставимо со среднеоператорской Whoosh); в Санкт-Петербурге – 609; в Краснодаре – 564; в Екатеринбурге – 319 (почти вдвое ниже среднего по оператору); в Новосибирске – 277 при темпах роста +129 % YoY за 9 мес. 2025 г. Гэп между лидером и МТС Юрент по утилизации сильнее выражен в городах с резервом плотности и зрелым спросом (Екатеринбург, Краснодар) и слабее – на регуляторно перегруженных и насыщенных рынках (Москва), где сам предельный эффект расширения для всех операторов снижается. Закрытие гэпа не сводится к универсальному наращиванию парка и требует дифференциации действий по типам региональных рынков – к этому ведёт логика §2.1.3 и §2.3.</w:t>
-      </w:r>
-    </w:p>
-    <w:p>
-      <w:pPr>
-        <w:pStyle w:val="Heading3"/>
-      </w:pPr>
-      <w:r>
-        <w:t>2.1.3 Стратегически значимые различия между региональными рынками: принцип отбора</w:t>
+        <w:t>Региональные гэпы МТС Юрент относительно лидера. Сравнение операторов выявляет систематическое отставание МТС Юрент от Whoosh по выручке на самокат (49,4 vs 66,8 тыс. руб./год на единицу парка) и по утилизации; разрыв возникает не столько из-за меньшего размера парка, сколько из-за более низкой эффективности уже размещённого парка. В региональном разрезе по данным эксперта А. (поквартальная отчётность по 86 субъектам РФ за 2024 и 9 месяцев 2025) гэп различается: в Москве МТС Юрент работает с утилизацией 1 073 поездки на самокат в год (сопоставимо со среднеоператорской Whoosh); в Санкт-Петербурге – 609; в Краснодаре – 564; в Екатеринбурге – 319 (почти вдвое ниже среднего по оператору); в Новосибирске – 277 при темпах роста +129 % YoY за 9 мес. 2025 г. Гэп между лидером и МТС Юрент по утилизации сильнее выражен в городах с резервом плотности и зрелым спросом (Екатеринбург, Краснодар) и слабее – на регуляторно перегруженных и насыщенных рынках (Москва), где сам предельный эффект расширения для всех операторов снижается. Закрытие гэпа не сводится к универсальному наращиванию парка и требует дифференциации действий по типам региональных рынков – к этому ведёт логика §2,1.3 и §2,3.</w:t>
+      </w:r>
+    </w:p>
+    <w:p>
+      <w:pPr>
+        <w:jc w:val="both"/>
+      </w:pPr>
+      <w:r>
+        <w:t>2,1.3 Стратегически значимые различия между региональными рынками: принцип отбора</w:t>
       </w:r>
     </w:p>
     <w:p>
@@ -1649,10 +1649,10 @@
     </w:p>
     <w:p>
       <w:pPr>
-        <w:pStyle w:val="Heading4"/>
-      </w:pPr>
-      <w:r>
-        <w:t>2.1.3.1 Параметры рыночной конфигурации, меняющие реализуемость базовой конкурентной модели</w:t>
+        <w:jc w:val="both"/>
+      </w:pPr>
+      <w:r>
+        <w:t>2,1.3.1 Параметры рыночной конфигурации, меняющие реализуемость базовой конкурентной модели</w:t>
       </w:r>
     </w:p>
     <w:p>
@@ -1665,10 +1665,10 @@
     </w:p>
     <w:p>
       <w:pPr>
-        <w:pStyle w:val="Heading4"/>
-      </w:pPr>
-      <w:r>
-        <w:t>2.1.3.2 Структурная конфигурация рынка (I уровень)</w:t>
+        <w:jc w:val="both"/>
+      </w:pPr>
+      <w:r>
+        <w:t>2,1.3.2 Структурная конфигурация рынка (I уровень)</w:t>
       </w:r>
     </w:p>
     <w:p>
@@ -1809,10 +1809,10 @@
     </w:p>
     <w:p>
       <w:pPr>
-        <w:pStyle w:val="Heading4"/>
-      </w:pPr>
-      <w:r>
-        <w:t>2.1.3.3 Операционная исполнимость базовой модели (II уровень)</w:t>
+        <w:jc w:val="both"/>
+      </w:pPr>
+      <w:r>
+        <w:t>2,1.3.3 Операционная исполнимость базовой модели (II уровень)</w:t>
       </w:r>
     </w:p>
     <w:p>
@@ -1857,10 +1857,10 @@
     </w:p>
     <w:p>
       <w:pPr>
-        <w:pStyle w:val="Heading4"/>
-      </w:pPr>
-      <w:r>
-        <w:t>2.1.3.4 Тактические рычаги управления присутствием (III уровень)</w:t>
+        <w:jc w:val="both"/>
+      </w:pPr>
+      <w:r>
+        <w:t>2,1.3.4 Тактические рычаги управления присутствием (III уровень)</w:t>
       </w:r>
     </w:p>
     <w:p>
@@ -1873,10 +1873,10 @@
     </w:p>
     <w:p>
       <w:pPr>
-        <w:pStyle w:val="Heading4"/>
-      </w:pPr>
-      <w:r>
-        <w:t>2.1.3.5 Сочетание факторов как основа стратегически значимого различения рынков</w:t>
+        <w:jc w:val="both"/>
+      </w:pPr>
+      <w:r>
+        <w:t>2,1.3.5 Сочетание факторов как основа стратегически значимого различения рынков</w:t>
       </w:r>
     </w:p>
     <w:p>
@@ -1929,10 +1929,10 @@
     </w:p>
     <w:p>
       <w:pPr>
-        <w:pStyle w:val="Heading4"/>
-      </w:pPr>
-      <w:r>
-        <w:t>2.1.3.6 Демонстрационный портфель: сочетания факторов на пяти рынках</w:t>
+        <w:jc w:val="both"/>
+      </w:pPr>
+      <w:r>
+        <w:t>2,1.3.6 Демонстрационный портфель: сочетания факторов на пяти рынках</w:t>
       </w:r>
     </w:p>
     <w:p>
@@ -1953,7 +1953,7 @@
         <w:rPr>
           <w:i/>
         </w:rPr>
-        <w:t>Таблица 2.1.3.1. Сочетания факторов I и II уровней в демонстрационном портфеле городов.</w:t>
+        <w:t>Таблица 2,1.3,1. Сочетания факторов I и II уровней в демонстрационном портфеле городов.</w:t>
       </w:r>
     </w:p>
     <w:tbl>
@@ -3163,23 +3163,23 @@
         <w:jc w:val="both"/>
       </w:pPr>
       <w:r>
-        <w:t>Сценарий S3 – диверсификация режимов по портфелю. Оператор различает сценарно-однородные группы рынков и применяет к ним разные режимы конкурентных действий: в одних городах – режим экспансии, в других – режим удержания, в третьих – режим сокращения. Внутри каждого режима сохраняется типовой набор рычагов и показателей; различие заключается в том, какой именно режим назначается рынку. Управленческая логика сценария исходит из положения о том, что одинаковая модель действий во всех городах при сильной неоднородности конфигураций даёт меньший конкурентный результат, чем дифференцированная. Преимущества S3 связаны с возможностью точнее распределять управленческое внимание и ресурсы, концентрируя операционную интенсивность там, где она даёт отдачу, и снижая её там, где сильное присутствие экономически нецелесообразно. Ограничения S3 связаны с повышенными требованиями к управленческим способностям: необходимостью различать рынки на уровне портфеля, синхронизировать действия между режимами и поддерживать единообразие пользовательского опыта при дифференцированной операционной модели. Эти ограничения подробно разбираются в §2.3.1 и §3.5.</w:t>
-      </w:r>
-    </w:p>
-    <w:p>
-      <w:pPr>
-        <w:jc w:val="both"/>
-      </w:pPr>
-      <w:r>
-        <w:t>Три сценария различаются по двум измерениям: степени единообразия управленческой логики между городами и глубине различения рыночных конфигураций. S1 удерживает единообразие действий и не требует дифференциации рынков; S2 удерживает единый режим, но допускает операционную адаптацию; S3 допускает разные режимы для разных групп рынков. Распределение ответственности между уровнями организации и набор требуемых способностей у этих сценариев также различается: чем глубже различение, тем выше нагрузка на функцию портфельного управления и на блок локальной экспертизы. Содержательное наполнение сценариев, то есть набор режимов, из которых они складываются, – рассматривается в §3.1, а сопоставление сценариев по экономически защищаемым критериям и обоснование выбора – в §2.3.1.</w:t>
-      </w:r>
-    </w:p>
-    <w:p>
-      <w:pPr>
-        <w:pStyle w:val="Heading3"/>
-      </w:pPr>
-      <w:r>
-        <w:t>2.3.1 Сопоставление сценариев по пяти критериям и обоснование выбора</w:t>
+        <w:t>Сценарий S3 – диверсификация режимов по портфелю. Оператор различает сценарно-однородные группы рынков и применяет к ним разные режимы конкурентных действий: в одних городах – режим экспансии, в других – режим удержания, в третьих – режим сокращения. Внутри каждого режима сохраняется типовой набор рычагов и показателей; различие заключается в том, какой именно режим назначается рынку. Управленческая логика сценария исходит из положения о том, что одинаковая модель действий во всех городах при сильной неоднородности конфигураций даёт меньший конкурентный результат, чем дифференцированная. Преимущества S3 связаны с возможностью точнее распределять управленческое внимание и ресурсы, концентрируя операционную интенсивность там, где она даёт отдачу, и снижая её там, где сильное присутствие экономически нецелесообразно. Ограничения S3 связаны с повышенными требованиями к управленческим способностям: необходимостью различать рынки на уровне портфеля, синхронизировать действия между режимами и поддерживать единообразие пользовательского опыта при дифференцированной операционной модели. Эти ограничения подробно разбираются в §2,3.1 и §3,5.</w:t>
+      </w:r>
+    </w:p>
+    <w:p>
+      <w:pPr>
+        <w:jc w:val="both"/>
+      </w:pPr>
+      <w:r>
+        <w:t>Три сценария различаются по двум измерениям: степени единообразия управленческой логики между городами и глубине различения рыночных конфигураций. S1 удерживает единообразие действий и не требует дифференциации рынков; S2 удерживает единый режим, но допускает операционную адаптацию; S3 допускает разные режимы для разных групп рынков. Распределение ответственности между уровнями организации и набор требуемых способностей у этих сценариев также различается: чем глубже различение, тем выше нагрузка на функцию портфельного управления и на блок локальной экспертизы. Содержательное наполнение сценариев, то есть набор режимов, из которых они складываются, – рассматривается в §3.1, а сопоставление сценариев по экономически защищаемым критериям и обоснование выбора – в §2,3.1.</w:t>
+      </w:r>
+    </w:p>
+    <w:p>
+      <w:pPr>
+        <w:jc w:val="both"/>
+      </w:pPr>
+      <w:r>
+        <w:t>2,3.1 Сопоставление сценариев по пяти критериям и обоснование выбора</w:t>
       </w:r>
     </w:p>
     <w:p>
@@ -3235,7 +3235,7 @@
         <w:jc w:val="both"/>
       </w:pPr>
       <w:r>
-        <w:t>Критерий нужен для рассмотрения реализуемости сценария при текущей операционной зрелости оператора и при заданных регуляторных ограничениях. S1 реализуем по определению – он описывает текущее состояние; вопрос в том, остаётся ли он эффективным, а не в том, можно ли его исполнить. S2 требует операционной дисциплины во всех городах одновременно, но в рамках одного режима, что снижает требования к функции портфельного управления и к способности параллельно поддерживать разные операционные стандарты. S3 требует одновременной поддержки разных режимов R1–R3 в разных городах, что повышает нагрузку на функцию портфельного управления и на блок локальной экспертизы. По этому критерию S2 сильнее S3, S3 сильнее S1 на горизонте перестройки операционной модели. Это та область, где S3 имеет управленческое ограничение и где компенсаторные механизмы рассматриваются в §3.5.</w:t>
+        <w:t>Критерий нужен для рассмотрения реализуемости сценария при текущей операционной зрелости оператора и при заданных регуляторных ограничениях. S1 реализуем по определению – он описывает текущее состояние; вопрос в том, остаётся ли он эффективным, а не в том, можно ли его исполнить. S2 требует операционной дисциплины во всех городах одновременно, но в рамках одного режима, что снижает требования к функции портфельного управления и к способности параллельно поддерживать разные операционные стандарты. S3 требует одновременной поддержки разных режимов R1–R3 в разных городах, что повышает нагрузку на функцию портфельного управления и на блок локальной экспертизы. По этому критерию S2 сильнее S3, S3 сильнее S1 на горизонте перестройки операционной модели. Это та область, где S3 имеет управленческое ограничение и где компенсаторные механизмы рассматриваются в §3,5.</w:t>
       </w:r>
     </w:p>
     <w:p>
@@ -3251,7 +3251,7 @@
         <w:jc w:val="both"/>
       </w:pPr>
       <w:r>
-        <w:t>Критерий ставит вопрос о ожидаемом приросте EBITDA на портфеле городов в горизонте сезона и о его распределении между рынками присутствия. S1 в условиях зрелых и насыщенных рынков теряет источник новой ценности от расширения и одновременно несёт издержки избыточного давления в чувствительных конфигурациях; ожидаемая динамика – стагнация выручки на самокат при сохранении текущих операционных издержек, с риском ухудшения в регуляторно жёстких городах. S2 через единый режим R3 удерживает экономику покрытия и стабилизирует выручку на самокат, но не использует возможности экспансии в рынках с запасом плотности (например, R2 в Екатеринбурге) и оставляет нерешённой проблему рынков, где сильное присутствие нецелесообразно (R3). S3 допускает максимизацию отдачи в условиях неоднородности: в рынках R2 – рост поездок и доли при ограниченном росте парка (проектный инструмент §3.2), в рынках R3 – стабилизация маржи через дисциплину расстановки, в рынках R3 – снижение операционной нагрузки без потери существенной выручки. Демонстрационный портфель §2.3.1 показывает направления этой динамики качественно, без претензии на точные финансовые прогнозы. По этому критерию S3 сильнее S2, S2 сильнее S1.</w:t>
+        <w:t>Критерий ставит вопрос о ожидаемом приросте EBITDA на портфеле городов в горизонте сезона и о его распределении между рынками присутствия. S1 в условиях зрелых и насыщенных рынков теряет источник новой ценности от расширения и одновременно несёт издержки избыточного давления в чувствительных конфигурациях; ожидаемая динамика – стагнация выручки на самокат при сохранении текущих операционных издержек, с риском ухудшения в регуляторно жёстких городах. S2 через единый режим R3 удерживает экономику покрытия и стабилизирует выручку на самокат, но не использует возможности экспансии в рынках с запасом плотности (например, R2 в Екатеринбурге) и оставляет нерешённой проблему рынков, где сильное присутствие нецелесообразно (R3). S3 допускает максимизацию отдачи в условиях неоднородности: в рынках R2 – рост поездок и доли при ограниченном росте парка (проектный инструмент §3.2), в рынках R3 – стабилизация маржи через дисциплину расстановки, в рынках R3 – снижение операционной нагрузки без потери существенной выручки. Демонстрационный портфель §2,3.1 показывает направления этой динамики качественно, без претензии на точные финансовые прогнозы. По этому критерию S3 сильнее S2, S2 сильнее S1.</w:t>
       </w:r>
     </w:p>
     <w:p>
@@ -3267,7 +3267,7 @@
         <w:jc w:val="both"/>
       </w:pPr>
       <w:r>
-        <w:t>Критерий ставит вопрос о структуре и величине рисков, о концентрации риска в одной точке или его распределении по портфелю. S1 концентрирует риск в связи с унификацией действий между регионами: ужесточение регулирования или агрессивные действия конкурента в нескольких ключевых городах одновременно ухудшают результат всего портфеля, поскольку оператор не может реагировать дифференцированно. S2 снижает этот риск за счёт операционной адаптации, но сохраняет риск концентрации в режиме R3: при появлении агрессивного претендента в нескольких городах одновременно режим удержания может оказаться структурно неподходящим (целесообразен переход к R2 хотя бы в части городов). S3 распределяет риск между режимами и типами рынков; одновременно вводится новый риск – риск рассинхронизации режимов и потери единообразия пользовательского опыта, обсуждаемый в §3.5. По этому критерию S3 распределяет риск шире, чем S1 и S2, ценой повышенных требований к управленческой координации.</w:t>
+        <w:t>Критерий ставит вопрос о структуре и величине рисков, о концентрации риска в одной точке или его распределении по портфелю. S1 концентрирует риск в связи с унификацией действий между регионами: ужесточение регулирования или агрессивные действия конкурента в нескольких ключевых городах одновременно ухудшают результат всего портфеля, поскольку оператор не может реагировать дифференцированно. S2 снижает этот риск за счёт операционной адаптации, но сохраняет риск концентрации в режиме R3: при появлении агрессивного претендента в нескольких городах одновременно режим удержания может оказаться структурно неподходящим (целесообразен переход к R2 хотя бы в части городов). S3 распределяет риск между режимами и типами рынков; одновременно вводится новый риск – риск рассинхронизации режимов и потери единообразия пользовательского опыта, обсуждаемый в §3,5. По этому критерию S3 распределяет риск шире, чем S1 и S2, ценой повышенных требований к управленческой координации.</w:t>
       </w:r>
     </w:p>
     <w:p>
@@ -3347,7 +3347,7 @@
         <w:jc w:val="both"/>
       </w:pPr>
       <w:r>
-        <w:t>Проведённый анализ показывает, что стратегический смысл рынка раскрывается на уровне сочетания параметров I и II уровней. Их совместное действие позволяет понять, где усиление присутствия сохраняет экономическую оправданность, где ключевым становится качество исполнения, где возрастает значение институциональной адаптации и где цена удержания позиции меняет допустимую форму участия в рынке. Демонстрационный портфель из пяти городов (§2.1.3.6) показывает, что эти сочетания на реальной географии заметно расходятся и что рамка не сводится к одной оси различения.</w:t>
+        <w:t>Проведённый анализ показывает, что стратегический смысл рынка раскрывается на уровне сочетания параметров I и II уровней. Их совместное действие позволяет понять, где усиление присутствия сохраняет экономическую оправданность, где ключевым становится качество исполнения, где возрастает значение институциональной адаптации и где цена удержания позиции меняет допустимую форму участия в рынке. Демонстрационный портфель из пяти городов (§2,1.3.6) показывает, что эти сочетания на реальной географии заметно расходятся и что рамка не сводится к одной оси различения.</w:t>
       </w:r>
     </w:p>
     <w:p>
@@ -3384,7 +3384,7 @@
         <w:jc w:val="both"/>
       </w:pPr>
       <w:r>
-        <w:t>Сценарии §2.3 различаются тем, какие именно режимы конкурентных действий применяются к городам портфеля. В работе используется каркас из трёх режимов: R1 «Плацдарм», R2 «Атака» и R3 «Удержание» (с ограниченной формой для регуляторно тяжёлых рынков). Каждый режим описывается через однородный набор полей: цель, условия применения – на каких сочетаниях параметров I и II уровней (см. §2.1.3.2, §2.1.3.3) он уместен, типичные рычаги, включая инструменты III уровня (см. §2.1.3.4), измеримые показатели и ограничения. Это делает сопоставимыми диагностики между городами и между сценариями.</w:t>
+        <w:t>Сценарии §2.3 различаются тем, какие именно режимы конкурентных действий применяются к городам портфеля. В работе используется каркас из трёх режимов: R1 «Плацдарм», R2 «Атака» и R3 «Удержание» (с ограниченной формой для регуляторно тяжёлых рынков). Каждый режим описывается через однородный набор полей: цель, условия применения – на каких сочетаниях параметров I и II уровней (см. §2,1.3.2, §2,1.3.3) он уместен, типичные рычаги, включая инструменты III уровня (см. §2,1.3.4), измеримые показатели и ограничения. Это делает сопоставимыми диагностики между городами и между сценариями.</w:t>
       </w:r>
     </w:p>
     <w:p>
@@ -3472,7 +3472,7 @@
         <w:jc w:val="both"/>
       </w:pPr>
       <w:r>
-        <w:t>Условия применения. Рынки с высокой ёмкостью и средней-высокой предельной отдачей на увеличение присутствия (по терминологии §2.1.3.2), где у оператора есть запас по плотности относительно лидера и сохраняется источник новой ценности от усиления покрытия. Регуляторная среда не блокирует наращивание парка; операционная исполнимость (II уровень) допускает рост покрытия без резкого ухудшения экономики обслуживания. Положение оператора – преследователь с потенциалом сокращения отрыва.</w:t>
+        <w:t>Условия применения. Рынки с высокой ёмкостью и средней-высокой предельной отдачей на увеличение присутствия (по терминологии §2,1.3.2), где у оператора есть запас по плотности относительно лидера и сохраняется источник новой ценности от усиления покрытия. Регуляторная среда не блокирует наращивание парка; операционная исполнимость (II уровень) допускает рост покрытия без резкого ухудшения экономики обслуживания. Положение оператора – преследователь с потенциалом сокращения отрыва.</w:t>
       </w:r>
     </w:p>
     <w:p>
@@ -4066,7 +4066,7 @@
         <w:jc w:val="both"/>
       </w:pPr>
       <w:r>
-        <w:t>Конкурентный анализ §2.1.2 зафиксировал, что на зрелом рынке кикшеринга критическим ключевым фактором успеха является фактическая доступность самоката в нужной точке и в нужное время, то есть качество покрытия с учётом микрогеометрии города и колебаний спроса. Проектный инструмент настоящего параграфа адресует именно этот КФУ: УПС повышает фактическую доступность парка за счёт точечного перераспределения внутри уже сформированного покрытия, без пропорционального наращивания физического парка. Логика предыдущих разделов показывает, что при достигнутом масштабе МТС Юрент конкурентный результат всё в большей степени зависит не от общего размера парка, а от того, насколько точно техника распределяется внутри уже занятого пространства. Конкурентная проблема смещается с уровня размера парка на уровень фактической доступности самокатов в чувствительных микролокациях городской среды. Даже при формально достаточном количестве техники оператор может терять поездки и ослаблять позицию из-за локальных разрывов покрытия. Для МТС Юрент, работающего в широкой и неоднородной географии, это означает, что один и тот же объём парка даёт разный результат в зависимости от точности его распределения внутри конкретного города.</w:t>
+        <w:t>Конкурентный анализ §2,1.2 зафиксировал, что на зрелом рынке кикшеринга критическим ключевым фактором успеха является фактическая доступность самоката в нужной точке и в нужное время, то есть качество покрытия с учётом микрогеометрии города и колебаний спроса. Проектный инструмент настоящего параграфа адресует именно этот КФУ: УПС повышает фактическую доступность парка за счёт точечного перераспределения внутри уже сформированного покрытия, без пропорционального наращивания физического парка. Логика предыдущих разделов показывает, что при достигнутом масштабе МТС Юрент конкурентный результат всё в большей степени зависит не от общего размера парка, а от того, насколько точно техника распределяется внутри уже занятого пространства. Конкурентная проблема смещается с уровня размера парка на уровень фактической доступности самокатов в чувствительных микролокациях городской среды. Даже при формально достаточном количестве техники оператор может терять поездки и ослаблять позицию из-за локальных разрывов покрытия. Для МТС Юрент, работающего в широкой и неоднородной географии, это означает, что один и тот же объём парка даёт разный результат в зависимости от точности его распределения внутри конкретного города.</w:t>
       </w:r>
     </w:p>
     <w:p>
@@ -4242,7 +4242,7 @@
         <w:jc w:val="both"/>
       </w:pPr>
       <w:r>
-        <w:t>В терминах сценария S3 это означает, что проектный инструмент даёт дополнительную операционную гибкость в режимах R2 и R3, которые в демонстрационном портфеле применяются к четырём из пяти городов (Петербург, Екатеринбург, Краснодар, Новосибирск). Это делает сценарий S3 более устойчивым по критерию операционной исполнимости (§2.3.1, критерий 3): инструмент снижает нагрузку, возникающую при параллельной поддержке нескольких режимов в разных городах.</w:t>
+        <w:t>В терминах сценария S3 это означает, что проектный инструмент даёт дополнительную операционную гибкость в режимах R2 и R3, которые в демонстрационном портфеле применяются к четырём из пяти городов (Петербург, Екатеринбург, Краснодар, Новосибирск). Это делает сценарий S3 более устойчивым по критерию операционной исполнимости (§2,3.1, критерий 3): инструмент снижает нагрузку, возникающую при параллельной поддержке нескольких режимов в разных городах.</w:t>
       </w:r>
     </w:p>
     <w:p>
@@ -4338,7 +4338,7 @@
         <w:jc w:val="both"/>
       </w:pPr>
       <w:r>
-        <w:t>Для предметного описания сценария S3 в работе используется демонстрационный портфель из пяти городов, введённый в п. 2.4.1: Москва, Санкт-Петербург, Екатеринбург, Краснодар, Новосибирск. По каждому городу фиксируется назначаемый режим R1–R3 (с подтипом, где это применимо), приоритетные рычаги, ожидаемые направления финансово-операционной динамики и оговорка о применимости проектного инструмента §3.3. Карта подаётся как качественная: количественные параметры (выручка на самокат, плотность парка, доля поездок) указываются на уровне направлений изменения. Исключение составляют проектные допущения по Екатеринбургу, в которых пилот МТС Юрент с инструментом управления покрытием через стимулы рассматривается как предметная проектная конфигурация; они используются как допущения.</w:t>
+        <w:t>Для предметного описания сценария S3 в работе используется демонстрационный портфель из пяти городов, введённый в п. 2,4.1: Москва, Санкт-Петербург, Екатеринбург, Краснодар, Новосибирск. По каждому городу фиксируется назначаемый режим R1–R3 (с подтипом, где это применимо), приоритетные рычаги, ожидаемые направления финансово-операционной динамики и оговорка о применимости проектного инструмента §3,3. Карта подаётся как качественная: количественные параметры (выручка на самокат, плотность парка, доля поездок) указываются на уровне направлений изменения. Исключение составляют проектные допущения по Екатеринбургу, в которых пилот МТС Юрент с инструментом управления покрытием через стимулы рассматривается как предметная проектная конфигурация; они используются как допущения.</w:t>
       </w:r>
     </w:p>
     <w:p>
@@ -4386,7 +4386,7 @@
         <w:jc w:val="both"/>
       </w:pPr>
       <w:r>
-        <w:t>Применимость §3.3. Ограниченная: УПС работает там, где стоит задача защиты доступности в чувствительных микролокациях. В режиме R3 число таких микролокаций невелико, и инструмент применяется выборочно.</w:t>
+        <w:t>Применимость §3,3. Ограниченная: УПС работает там, где стоит задача защиты доступности в чувствительных микролокациях. В режиме R3 число таких микролокаций невелико, и инструмент применяется выборочно.</w:t>
       </w:r>
     </w:p>
     <w:p>
@@ -4434,7 +4434,7 @@
         <w:jc w:val="both"/>
       </w:pPr>
       <w:r>
-        <w:t>Применимость §3.3. Высокая: УПС применяется как способ повысить отдачу от сформированного парка без пропорционального роста его размера, что особенно важно в условиях частичных регуляторных ограничений на физическое наращивание парка.</w:t>
+        <w:t>Применимость §3,3. Высокая: УПС применяется как способ повысить отдачу от сформированного парка без пропорционального роста его размера, что особенно важно в условиях частичных регуляторных ограничений на физическое наращивание парка.</w:t>
       </w:r>
     </w:p>
     <w:p>
@@ -4458,7 +4458,7 @@
         <w:jc w:val="both"/>
       </w:pPr>
       <w:r>
-        <w:t>Назначаемый режим. R2 с пилотом инструмента §3.3. Сочетание ёмкости, позиции преследователя и резерва плотности делает Екатеринбург предметной конфигурацией, на которой S3 проявляется наиболее отчётливо: одновременно работают экспансия и проектный инструмент.</w:t>
+        <w:t>Назначаемый режим. R2 с пилотом инструмента §3,3. Сочетание ёмкости, позиции преследователя и резерва плотности делает Екатеринбург предметной конфигурацией, на которой S3 проявляется наиболее отчётливо: одновременно работают экспансия и проектный инструмент.</w:t>
       </w:r>
     </w:p>
     <w:p>
@@ -4482,7 +4482,7 @@
         <w:jc w:val="both"/>
       </w:pPr>
       <w:r>
-        <w:t>Применимость §3.3. Высокая, как пилотная конфигурация.</w:t>
+        <w:t>Применимость §3,3. Высокая, как пилотная конфигурация.</w:t>
       </w:r>
     </w:p>
     <w:p>
@@ -4530,7 +4530,7 @@
         <w:jc w:val="both"/>
       </w:pPr>
       <w:r>
-        <w:t>Применимость §3.3. Высокая: длинный сезон повышает ценность инструмента, снижающего долю физической ребалансировки.</w:t>
+        <w:t>Применимость §3,3. Высокая: длинный сезон повышает ценность инструмента, снижающего долю физической ребалансировки.</w:t>
       </w:r>
     </w:p>
     <w:p>
@@ -4578,7 +4578,7 @@
         <w:jc w:val="both"/>
       </w:pPr>
       <w:r>
-        <w:t>Применимость §3.3. Высокая: короткий сезон и большая протяжённость делают инструмент управления покрытием через стимулы особенно ценным как способ удерживать качество присутствия без избыточных операционных издержек.</w:t>
+        <w:t>Применимость §3,3. Высокая: короткий сезон и большая протяжённость делают инструмент управления покрытием через стимулы особенно ценным как способ удерживать качество присутствия без избыточных операционных издержек.</w:t>
       </w:r>
     </w:p>
     <w:p>
@@ -5324,7 +5324,7 @@
         <w:jc w:val="both"/>
       </w:pPr>
       <w:r>
-        <w:t>Демонстрационный портфель составлен из городов, в которых МТС Юрент уже присутствует, поэтому подтип R1 «Ограниченный вход» в нём не представлен. Это методологический выбор, а не ограничение каркаса: R1 сохраняет смысл как самостоятельный подтип для ситуаций возможного входа на рынки, где компания пока не работает или присутствует минимально, и применяется по той же управленческой логике, которая описана в §3.1. В терминах сценария S3 R1 используется при расширении портфеля за пределы текущих 187 локаций, тогда как три режима в демонстрационном портфеле (R2, R3 и переходные комбинации R2→R3) описывают работу в уже сложившейся географии присутствия. Содержание проектного инструмента §3.3 – управление покрытием через стимулы – далее рассматривается отдельно.</w:t>
+        <w:t>Демонстрационный портфель составлен из городов, в которых МТС Юрент уже присутствует, поэтому подтип R1 «Ограниченный вход» в нём не представлен. Это методологический выбор, а не ограничение каркаса: R1 сохраняет смысл как самостоятельный подтип для ситуаций возможного входа на рынки, где компания пока не работает или присутствует минимально, и применяется по той же управленческой логике, которая описана в §3,1. В терминах сценария S3 R1 используется при расширении портфеля за пределы текущих 187 локаций, тогда как три режима в демонстрационном портфеле (R2, R3 и переходные комбинации R2→R3) описывают работу в уже сложившейся географии присутствия. Содержание проектного инструмента §3.3 – управление покрытием через стимулы – далее рассматривается отдельно.</w:t>
       </w:r>
     </w:p>
     <w:p>
@@ -5366,7 +5366,7 @@
         <w:jc w:val="both"/>
       </w:pPr>
       <w:r>
-        <w:t>Финансово-операционная карта §3.3 описала S3 качественно: режим, рычаги, направление динамики. В настоящем параграфе сценарий S3 переводится в количественный формат: формулируются статьи затрат на его реализацию, статьи ожидаемых эффектов на портфеле из пяти городов и сводный чистый эффект на горизонте 12 месяцев. Источники данных – внутренняя поквартальная отчётность МТС Юрент по регионам РФ за 2024 и 9 месяцев 2025 года, предоставленная экспертом А.; публичная отчётность ПАО «ВУШ Холдинг» по МСФО; расчёт по проектному инструменту УПС §3.2. Все статьи финмодели снабжены явно маркированными допущениями и диапазонами чувствительности.</w:t>
+        <w:t>Финансово-операционная карта §3.3 описала S3 качественно: режим, рычаги, направление динамики. В настоящем параграфе сценарий S3 переводится в количественный формат: формулируются статьи затрат на его реализацию, статьи ожидаемых эффектов на портфеле из пяти городов и сводный чистый эффект на горизонте 12 месяцев. Источники данных – внутренняя поквартальная отчётность МТС Юрент по регионам РФ за 2024 и 9 месяцев 2025 года, предоставленная экспертом А.; публичная отчётность ПАО «ВУШ Холдинг» по МСФО; расчёт по проектному инструменту УПС §3,2. Все статьи финмодели снабжены явно маркированными допущениями и диапазонами чувствительности.</w:t>
       </w:r>
     </w:p>
     <w:p>
@@ -5382,7 +5382,7 @@
         <w:jc w:val="both"/>
       </w:pPr>
       <w:r>
-        <w:t>В качестве базовой линии (сценарий S1) принимается сохранение текущей логики управления портфелем без дифференциации режимов. Совокупная выручка пяти городов демонстрационного портфеля по итогам 2024 года составила 4.17 млрд руб., что соответствует приблизительно 94 % выручки МТС Юрент за 2024 год по российскому рынку (7.04 млрд руб. по данным эксперта А.). Распределение выручки по городам резко неоднородно: Москва – 2.63 млрд руб. (63 % портфеля); Краснодар – 851 млн руб. (20 %); Санкт-Петербург – 475 млн руб. (11 %); Екатеринбург – 153 млн руб. (4 %); Новосибирск – 65 млн руб. (2 %). EBITDA-маржа сегмента у бенчмарк-оператора (ПАО «ВУШ Холдинг», кикшеринг, 9 мес. 2024) составила 28,6 %; для оценки эффектов в настоящей модели применяется консервативная маржа маржинального эффекта 25 %, отражающая операционный рычаг оператора-преследователя на зрелом рынке.</w:t>
+        <w:t>В качестве базовой линии (сценарий S1) принимается сохранение текущей логики управления портфелем без дифференциации режимов. Совокупная выручка пяти городов демонстрационного портфеля по итогам 2024 года составила 4,17 млрд руб., что соответствует приблизительно 94 % выручки МТС Юрент за 2024 год по российскому рынку (7,04 млрд руб. по данным эксперта А.). Распределение выручки по городам резко неоднородно: Москва – 2,63 млрд руб. (63 % портфеля); Краснодар – 851 млн руб. (20 %); Санкт-Петербург – 475 млн руб. (11 %); Екатеринбург – 153 млн руб. (4 %); Новосибирск – 65 млн руб. (2 %). EBITDA-маржа сегмента у бенчмарк-оператора (ПАО «ВУШ Холдинг», кикшеринг, 9 мес. 2024) составила 28,6 %; для оценки эффектов в настоящей модели применяется консервативная маржа маржинального эффекта 25 %, отражающая операционный рычаг оператора-преследователя на зрелом рынке.</w:t>
       </w:r>
     </w:p>
     <w:p>
@@ -5400,7 +5400,7 @@
         <w:ind w:firstLine="0" w:left="709"/>
       </w:pPr>
       <w:r>
-        <w:t>Москва: выручка -7.9 %, поездки -6.6 % – зрелый регуляторно перегруженный рынок;</w:t>
+        <w:t>Москва: выручка -7,9 %, поездки -6,6 % – зрелый регуляторно перегруженный рынок;</w:t>
       </w:r>
     </w:p>
     <w:p>
@@ -5410,7 +5410,7 @@
         <w:ind w:firstLine="0" w:left="709"/>
       </w:pPr>
       <w:r>
-        <w:t>Санкт-Петербург: выручка +41.1 %, поездки +42.3 % – рынок с активной фазой атаки и резервом плотности;</w:t>
+        <w:t>Санкт-Петербург: выручка +41,1 %, поездки +42,3 % – рынок с активной фазой атаки и резервом плотности;</w:t>
       </w:r>
     </w:p>
     <w:p>
@@ -5420,7 +5420,7 @@
         <w:ind w:firstLine="0" w:left="709"/>
       </w:pPr>
       <w:r>
-        <w:t>Краснодар: выручка -5.6 %, поездки -10.2 % – высокая конкуренция, длинный сезон;</w:t>
+        <w:t>Краснодар: выручка -5,6 %, поездки -10,2 % – высокая конкуренция, длинный сезон;</w:t>
       </w:r>
     </w:p>
     <w:p>
@@ -5430,7 +5430,7 @@
         <w:ind w:firstLine="0" w:left="709"/>
       </w:pPr>
       <w:r>
-        <w:t>Екатеринбург: выручка -4.3 %, поездки +4.1 % – позиция преследователя с резервом плотности;</w:t>
+        <w:t>Екатеринбург: выручка -4,3 %, поездки +4,1 % – позиция преследователя с резервом плотности;</w:t>
       </w:r>
     </w:p>
     <w:p>
@@ -5440,7 +5440,7 @@
         <w:ind w:firstLine="0" w:left="709"/>
       </w:pPr>
       <w:r>
-        <w:t>Новосибирск: выручка +143.2 %, поездки +128.9 % – фаза активного роста на стадии плацдарм / ранний R2.</w:t>
+        <w:t>Новосибирск: выручка +143,2 %, поездки +128,9 % – фаза активного роста на стадии плацдарм / ранний R2.</w:t>
       </w:r>
     </w:p>
     <w:p>
@@ -5453,7 +5453,7 @@
         <w:rPr>
           <w:i/>
         </w:rPr>
-        <w:t>Таблица 3.4.1 Базовые параметры портфеля пяти городов для финансовой модели (данные эксперта А.)</w:t>
+        <w:t>Таблица 3,4.1 Базовые параметры портфеля пяти городов для финансовой модели (данные эксперта А.)</w:t>
       </w:r>
     </w:p>
     <w:tbl>
@@ -5549,7 +5549,7 @@
                 <w:b/>
                 <w:sz w:val="22"/>
               </w:rPr>
-              <w:t>Парк 30.09.2024, шт.</w:t>
+              <w:t>Парк 30,09.2024, шт.</w:t>
             </w:r>
           </w:p>
         </w:tc>
@@ -6609,7 +6609,7 @@
         <w:jc w:val="both"/>
       </w:pPr>
       <w:r>
-        <w:t>Блок D. Обучение, накладные, управленческий резерв: ~3 млн руб./год. Обучение региональных менеджеров и аналитиков по работе с диагностической рамкой (трёхуровневая иерархия факторов §2.1.3 и каркас режимов §3.1), методическое сопровождение, резерв на непредвиденные расходы.</w:t>
+        <w:t>Блок D. Обучение, накладные, управленческий резерв: ~3 млн руб./год. Обучение региональных менеджеров и аналитиков по работе с диагностической рамкой (трёхуровневая иерархия факторов §2,1.3 и каркас режимов §3.1), методическое сопровождение, резерв на непредвиденные расходы.</w:t>
       </w:r>
     </w:p>
     <w:p>
@@ -6653,15 +6653,15 @@
         <w:jc w:val="both"/>
       </w:pPr>
       <w:r>
-        <w:t>Эффекты S3 распределены по трём режимам в соответствии с финансово-операционной картой §3.3.</w:t>
-      </w:r>
-    </w:p>
-    <w:p>
-      <w:pPr>
-        <w:jc w:val="both"/>
-      </w:pPr>
-      <w:r>
-        <w:t>Эффект 1. Прирост выручки в R2-городах за счёт дифференциации маркетинг-операционной политики (СПб, Екб, Крд, Нск). Допущение: дифференциация даёт прирост темпа годовой выручки на +3 п.п. относительно базовой линии S1 в R2-городах (консервативная оценка; диапазон чувствительности +1 …+5 п.п.). Применяя +3 п.п. к выручке 2024 по этим городам (1,544 млн руб.), получаем прирост выручки ~46.3 млн руб./год. При маржинальной EBITDA-марже 25 % это даёт прирост EBITDA ~11.6 млн руб./год.</w:t>
+        <w:t>Эффекты S3 распределены по трём режимам в соответствии с финансово-операционной картой §3,3.</w:t>
+      </w:r>
+    </w:p>
+    <w:p>
+      <w:pPr>
+        <w:jc w:val="both"/>
+      </w:pPr>
+      <w:r>
+        <w:t>Эффект 1. Прирост выручки в R2-городах за счёт дифференциации маркетинг-операционной политики (СПб, Екб, Крд, Нск). Допущение: дифференциация даёт прирост темпа годовой выручки на +3 п.п. относительно базовой линии S1 в R2-городах (консервативная оценка; диапазон чувствительности +1 …+5 п.п.). Применяя +3 п.п. к выручке 2024 по этим городам (1 544 млн руб.), получаем прирост выручки ~46,3 млн руб./год. При маржинальной EBITDA-марже 25 % это даёт прирост EBITDA ~11,6 млн руб./год.</w:t>
       </w:r>
     </w:p>
     <w:p>
@@ -6706,7 +6706,7 @@
         <w:rPr>
           <w:i/>
         </w:rPr>
-        <w:t>Таблица 3.4.2 Сводная финансовая модель S3 (год 1)</w:t>
+        <w:t>Таблица 3,4.2 Сводная финансовая модель S3 (год 1)</w:t>
       </w:r>
     </w:p>
     <w:tbl>
@@ -7340,7 +7340,7 @@
         <w:jc w:val="both"/>
       </w:pPr>
       <w:r>
-        <w:t>Выбор сценария S3 (§2.3.1) принимается с оговоркой: часть его управленческих рисков выше, чем у S1 и S2. В этом параграфе риски S3 консолидируются и сопоставляются с управленческими компенсаторами, доступными МТС Юрент.</w:t>
+        <w:t>Выбор сценария S3 (§2,3.1) принимается с оговоркой: часть его управленческих рисков выше, чем у S1 и S2. В этом параграфе риски S3 консолидируются и сопоставляются с управленческими компенсаторами, доступными МТС Юрент.</w:t>
       </w:r>
     </w:p>
     <w:p>
@@ -7396,7 +7396,7 @@
         <w:jc w:val="both"/>
       </w:pPr>
       <w:r>
-        <w:t>Распределение риска между типами рынков – основное преимущество S3 по критерию 5 §2.3.1 – даётся ценой повышенных требований к координации и не воспроизводится автоматически. Поэтому управленческие компенсаторы рассматриваются не как опция, а как условие реализации сценария.</w:t>
+        <w:t>Распределение риска между типами рынков – основное преимущество S3 по критерию 5 §2,3.1 – даётся ценой повышенных требований к координации и не воспроизводится автоматически. Поэтому управленческие компенсаторы рассматриваются не как опция, а как условие реализации сценария.</w:t>
       </w:r>
     </w:p>
     <w:p>
@@ -7412,15 +7412,15 @@
         <w:jc w:val="both"/>
       </w:pPr>
       <w:r>
-        <w:t>Анализ положения МТС Юрент показал, что при широкой географии присутствия стратегическое значение для компании имеет уже не сам факт работы в большом числе городов, а выбор управленческой логики обращения с портфелем региональных рынков. Вывод опирается на теоретико-аналитический диагноз Главы 1, рамку стратегически значимого различения рынков Главы 2 (трёхуровневая иерархия факторов и демонстрационный портфель §2.1.3.6) и на пять стратегических критериев, введённых в §1.6.</w:t>
-      </w:r>
-    </w:p>
-    <w:p>
-      <w:pPr>
-        <w:jc w:val="both"/>
-      </w:pPr>
-      <w:r>
-        <w:t>В качестве предмета стратегического выбора рассмотрены три сценария – сохранение текущей единой логики действий (S1), единый режим с операционной адаптацией (S2) и диверсификация режимов по портфелю (S3). Сценарии описаны через однородные поля (управленческая логика, ограничения, источники риска) и оценены по пяти критериям §1.6.</w:t>
+        <w:t>Анализ положения МТС Юрент показал, что при широкой географии присутствия стратегическое значение для компании имеет уже не сам факт работы в большом числе городов, а выбор управленческой логики обращения с портфелем региональных рынков. Вывод опирается на теоретико-аналитический диагноз Главы 1, рамку стратегически значимого различения рынков Главы 2 (трёхуровневая иерархия факторов и демонстрационный портфель §2,1.3.6) и на пять стратегических критериев, введённых в §1,6.</w:t>
+      </w:r>
+    </w:p>
+    <w:p>
+      <w:pPr>
+        <w:jc w:val="both"/>
+      </w:pPr>
+      <w:r>
+        <w:t>В качестве предмета стратегического выбора рассмотрены три сценария – сохранение текущей единой логики действий (S1), единый режим с операционной адаптацией (S2) и диверсификация режимов по портфелю (S3). Сценарии описаны через однородные поля (управленческая логика, ограничения, источники риска) и оценены по пяти критериям §1,6.</w:t>
       </w:r>
     </w:p>
     <w:p>
@@ -7505,7 +7505,7 @@
         <w:jc w:val="both"/>
       </w:pPr>
       <w:r>
-        <w:t>Практическим выходом работы стал проектный инструмент «Управление покрытием через стимулы» (УПС). Инструмент адресует ключевой фактор успеха оператора кикшеринга на зрелой стадии рынка – фактическую доступность самоката в нужной точке (§2.1.2). УПС снижает потребность в физической ребалансировке, замещая её стимулами для пользователей и внешних исполнителей; конструкция опирается на сочетание трёх типов механизмов – стимулы на стороне точки высадки, точки посадки и оплачиваемые микрозадания внешнему исполнителю. В составе сценария S3 УПС применим в режимах R2 и R3, что повышает устойчивость S3 по критерию операционной исполнимости. Для пилота инструмента предложены KPI и дорожная карта внедрения на горизонте 12 месяцев; базовый сценарий пилота в Екатеринбурге даёт чистый эффект 9,79 млн руб. за сезон (§3.2).</w:t>
+        <w:t>Практическим выходом работы стал проектный инструмент «Управление покрытием через стимулы» (УПС). Инструмент адресует ключевой фактор успеха оператора кикшеринга на зрелой стадии рынка – фактическую доступность самоката в нужной точке (§2,1.2). УПС снижает потребность в физической ребалансировке, замещая её стимулами для пользователей и внешних исполнителей; конструкция опирается на сочетание трёх типов механизмов – стимулы на стороне точки высадки, точки посадки и оплачиваемые микрозадания внешнему исполнителю. В составе сценария S3 УПС применим в режимах R2 и R3, что повышает устойчивость S3 по критерию операционной исполнимости. Для пилота инструмента предложены KPI и дорожная карта внедрения на горизонте 12 месяцев; базовый сценарий пилота в Екатеринбурге даёт чистый эффект 9,79 млн руб. за сезон (§3.2).</w:t>
       </w:r>
     </w:p>
     <w:p>
@@ -7558,319 +7558,319 @@
         <w:jc w:val="both"/>
       </w:pPr>
       <w:r>
-        <w:t>Aarhaug J., Fearnley N., Hartveit K. J. L., Johnsson E. Price and competition in emerging shared e-scooter markets // Research in Transportation Economics. 2023. Vol. 98. Art. 101303. DOI: 10.1016/j.retrec.2023.101303.</w:t>
-      </w:r>
-    </w:p>
-    <w:p>
-      <w:pPr>
-        <w:jc w:val="both"/>
-      </w:pPr>
-      <w:r>
-        <w:t>Aarhaug J., Fearnley N., Johnsson E. E-scooters and public transport – Complement or competition? // Research in Transportation Economics. 2023. Vol. 98. Art. 101279. DOI: 10.1016/j.retrec.2023.101279.</w:t>
-      </w:r>
-    </w:p>
-    <w:p>
-      <w:pPr>
-        <w:jc w:val="both"/>
-      </w:pPr>
-      <w:r>
-        <w:t>Abduljabbar R. L., Liyanage S., Dia H. The role of micro-mobility in shaping sustainable cities: A systematic literature review // Transportation Research Part D: Transport and Environment. 2021. Vol. 92. Art. 102734. DOI: 10.1016/j.trd.2021.102734.</w:t>
-      </w:r>
-    </w:p>
-    <w:p>
-      <w:pPr>
-        <w:jc w:val="both"/>
-      </w:pPr>
-      <w:r>
-        <w:t>Bobičić O., Esztergar-Kiss D. Enablers and barriers to micromobility adoption: Urban and suburban contexts // Sustainable Cities and Society. 2024. Vol. 111. Art. 105595. DOI: 10.1016/j.scs.2024.105595.</w:t>
-      </w:r>
-    </w:p>
-    <w:p>
-      <w:pPr>
-        <w:jc w:val="both"/>
-      </w:pPr>
-      <w:r>
-        <w:t>Carney M., Dieleman M., Taussig M. How are institutional capabilities transferred across borders? // Journal of World Business. 2016. Vol. 51, no. 6. P. 882–894. DOI: 10.1016/j.jwb.2015.12.002.</w:t>
-      </w:r>
-    </w:p>
-    <w:p>
-      <w:pPr>
-        <w:jc w:val="both"/>
-      </w:pPr>
-      <w:r>
-        <w:t>Cennamo C. Competing in Digital Markets: A Platform-Based Perspective // Academy of Management Perspectives. 2021. Vol. 35, no. 2. P. 265–291. DOI: 10.5465/amp.2016.0048.</w:t>
-      </w:r>
-    </w:p>
-    <w:p>
-      <w:pPr>
-        <w:jc w:val="both"/>
-      </w:pPr>
-      <w:r>
-        <w:t>Cennamo C., Santalo J. Platform competition: Strategic trade-offs in platform markets // Strategic Management Journal. 2013. Vol. 34, no. 11. P. 1331–1350. DOI: 10.1002/smj.2066.</w:t>
-      </w:r>
-    </w:p>
-    <w:p>
-      <w:pPr>
-        <w:jc w:val="both"/>
-      </w:pPr>
-      <w:r>
-        <w:t>Coenegrachts E., Vanelslander T., Verhetsel A., Beckers J. Analyzing shared mobility markets in Europe: A comparative analysis of shared mobility schemes across 311 European cities // Journal of Transport Geography. 2024. Vol. 118. Art. 103918. DOI: 10.1016/j.jtrangeo.2024.103918.</w:t>
-      </w:r>
-    </w:p>
-    <w:p>
-      <w:pPr>
-        <w:jc w:val="both"/>
-      </w:pPr>
-      <w:r>
-        <w:t>Coenegrachts E., Vanelslander T., Verhetsel A., Beckers J. Understanding the key criteria for shared mobility providers in their evaluation of potential markets // Journal of Urban Mobility. 2025. Vol. 7. Art. 100115. DOI: 10.1016/j.urbmob.2025.100115.</w:t>
-      </w:r>
-    </w:p>
-    <w:p>
-      <w:pPr>
-        <w:jc w:val="both"/>
-      </w:pPr>
-      <w:r>
-        <w:t>Dias G., Ribeiro P., Arsénio E. Determinants of shared e-scooter usage and their policy implications: Findings from a survey in Braga, Portugal // European Transport Research Review. 2024. Vol. 16. Art. 20. DOI: 10.1186/s12544-024-00642-4.</w:t>
-      </w:r>
-    </w:p>
-    <w:p>
-      <w:pPr>
-        <w:jc w:val="both"/>
-      </w:pPr>
-      <w:r>
-        <w:t>Gábor Š., Novotný L., Pregi L. Revealing Spatial Patterns of Dockless Shared Micromobility: A Case Study of Košice, Slovakia // Urban Science. 2025. Vol. 9, no. 4. Art. 107. DOI: 10.3390/urbansci9040107.</w:t>
-      </w:r>
-    </w:p>
-    <w:p>
-      <w:pPr>
-        <w:jc w:val="both"/>
-      </w:pPr>
-      <w:r>
-        <w:t>Garus A., Dadashev G., Ciuffo B., Nahmias-Biran B. H. Urban Micromobility in Practice: Insights from a Full-Year Analysis of Shared Scooter Use in Tel Aviv // Smart Cities. 2025. Vol. 8, no. 6. Art. 207. DOI: 10.3390/smartcities8060207.</w:t>
-      </w:r>
-    </w:p>
-    <w:p>
-      <w:pPr>
-        <w:jc w:val="both"/>
-      </w:pPr>
-      <w:r>
-        <w:t>Groth S., Ahlmeyer F., Albrecht J., Gerten C., Klinger T., Novack T. Uneven development in market-based supplies of new micromobility services: The case of new e-scooter services // npj Sustainable Mobility and Transport. 2025. Vol. 2. Art. 41. DOI: 10.1038/s44333-025-00060-6.</w:t>
-      </w:r>
-    </w:p>
-    <w:p>
-      <w:pPr>
-        <w:jc w:val="both"/>
-      </w:pPr>
-      <w:r>
-        <w:t>Interfax. Топ-менеджер МТС: электросамокаты становятся утилитарным транспортом, вписываясь в логику стратегии группы [Электронный ресурс]. 2024. 15 янв. URL: https://www.interfax.ru/interview/940294 (дата обращения: 18.01.2026).</w:t>
-      </w:r>
-    </w:p>
-    <w:p>
-      <w:pPr>
-        <w:jc w:val="both"/>
-      </w:pPr>
-      <w:r>
-        <w:t>Li A., Gao K., Zhao P., Axhausen K. W. Integrating shared e-scooters as the feeder to public transit: A comparative analysis of 124 European cities // Research in Transportation Economics. 2023. Vol. 99. Art. 101302. DOI: 10.1016/j.retrec.2023.101302.</w:t>
-      </w:r>
-    </w:p>
-    <w:p>
-      <w:pPr>
-        <w:jc w:val="both"/>
-      </w:pPr>
-      <w:r>
-        <w:t>Mitra R., Hess P. M. Who are the potential users of shared e-scooters? An examination of socio-demographic, attitudinal and environmental factors // Travel Behaviour and Society. 2021. Vol. 23. P. 100–107. DOI: 10.1016/j.tbs.2020.12.009.</w:t>
-      </w:r>
-    </w:p>
-    <w:p>
-      <w:pPr>
-        <w:jc w:val="both"/>
-      </w:pPr>
-      <w:r>
-        <w:t>Moran M. E. Drawing the map: The creation and regulation of geographic constraints on shared bikes and e-scooters in San Francisco, CA // Journal of Transport and Land Use. 2021. Vol. 14, no. 1. P. 459–487. DOI: 10.5198/jtlu.2021.1816.</w:t>
-      </w:r>
-    </w:p>
-    <w:p>
-      <w:pPr>
-        <w:jc w:val="both"/>
-      </w:pPr>
-      <w:r>
-        <w:t>Moran M. E., Laa B., Emberger G. Six scooter operators, six maps: Spatial coverage and regulation of micromobility in Vienna, Austria // Case Studies on Transport Policy. 2020. Vol. 8, no. 4. P. 1001–1011. DOI: 10.1016/j.cstp.2020.03.009.</w:t>
-      </w:r>
-    </w:p>
-    <w:p>
-      <w:pPr>
-        <w:jc w:val="both"/>
-      </w:pPr>
-      <w:r>
-        <w:t>NACTO. Shared Micromobility in the U.S.: 2019 [Электронный ресурс]. New York: National Association of City Transportation Officials, 2020. URL: https://nacto.org/wp-content/uploads/2020bikesharesnapshot.pdf (дата обращения: 19.02.2026).</w:t>
-      </w:r>
-    </w:p>
-    <w:p>
-      <w:pPr>
-        <w:jc w:val="both"/>
-      </w:pPr>
-      <w:r>
-        <w:t>NACTO. Shared Micromobility in the U.S. and Canada: 2023 [Электронный ресурс]. New York: National Association of City Transportation Officials, 2024. URL: https://nacto.org/publication/shared-micromobility-report-2023/ (дата обращения: 19.02.2026).</w:t>
-      </w:r>
-    </w:p>
-    <w:p>
-      <w:pPr>
-        <w:jc w:val="both"/>
-      </w:pPr>
-      <w:r>
-        <w:t>POLIS Governance &amp; Integration Working Group. Careful What You Wish For: Practical Implications of Rules &amp; Requirements for Shared Micromobility [Электронный ресурс]. Brussels: POLIS, 2025. URL: https://www.polisnetwork.eu/wp-content/uploads/2025/03/Shared-Micromobility-Regulations-Report.pdf (дата обращения: 11.03.2026).</w:t>
-      </w:r>
-    </w:p>
-    <w:p>
-      <w:pPr>
-        <w:jc w:val="both"/>
-      </w:pPr>
-      <w:r>
-        <w:t>Rietveld J., Schilling M. A. Platform Competition: A Systematic and Interdisciplinary Review of the Literature // Journal of Management. 2021. Vol. 47, no. 6. P. 1528–1563. DOI: 10.1177/0149206320969791.</w:t>
-      </w:r>
-    </w:p>
-    <w:p>
-      <w:pPr>
-        <w:jc w:val="both"/>
-      </w:pPr>
-      <w:r>
-        <w:t>Sareen S., Remme D., Haarstad H. E-scooter regulation: The micro-politics of market-making for micro-mobility in Bergen // Environmental Innovation and Societal Transitions. 2021. Vol. 40. P. 461–473. DOI: 10.1016/j.eist.2021.10.004.</w:t>
-      </w:r>
-    </w:p>
-    <w:p>
-      <w:pPr>
-        <w:jc w:val="both"/>
-      </w:pPr>
-      <w:r>
-        <w:t>Shah N. R., Ziedan A., Brakewood C., Cherry C. Shared e-scooter service providers with large fleet size have a competitive advantage: Findings from e-scooter demand and supply analysis of Nashville, Tennessee [Электронный ресурс] // SSRN Electronic Journal. 2022. Preprint. URL: https://ssrn.com/abstract=4167543 (дата обращения: 04.03.2026).</w:t>
-      </w:r>
-    </w:p>
-    <w:p>
-      <w:pPr>
-        <w:jc w:val="both"/>
-      </w:pPr>
-      <w:r>
-        <w:t>Teece D. J., Pisano G., Shuen A. Dynamic Capabilities and Strategic Management // Strategic Management Journal. 1997. Vol. 18, no. 7. P. 509–533. DOI: 10.1002/(SICI)1097-0266(199708)18:7&lt;509::AID-SMJ882&gt;3.0.CO;2-Z.</w:t>
-      </w:r>
-    </w:p>
-    <w:p>
-      <w:pPr>
-        <w:jc w:val="both"/>
-      </w:pPr>
-      <w:r>
-        <w:t>Департамент транспорта и развития дорожно-транспортной инфраструктуры города Москвы. Новые правила для аренды электросамокатов начнут действовать в новом сезоне проката [Электронный ресурс]. 2025. 10 февр. URL: https://transport.mos.ru/mostrans/all_news/123241 (дата обращения: 26.02.2026).</w:t>
-      </w:r>
-    </w:p>
-    <w:p>
-      <w:pPr>
-        <w:jc w:val="both"/>
-      </w:pPr>
-      <w:r>
-        <w:t>Иволгин А. В каких городах-миллионниках больше ездят на электросамокатах и сколько тратят самые активные пользователи [Электронный ресурс] // Т–Ж. 2024. 3 дек. URL: https://t-j.ru/kicksharing-stat/ (дата обращения: 27.02.2026).</w:t>
-      </w:r>
-    </w:p>
-    <w:p>
-      <w:pPr>
-        <w:jc w:val="both"/>
-      </w:pPr>
-      <w:r>
-        <w:t>Коммерсантъ. Кикшеринговым компаниям в Екатеринбурге пригрозили расторжением договоров [Электронный ресурс]. 2025. 11 апр. URL: https://www.kommersant.ru/doc/7655884 (дата обращения: 27.02.2026).</w:t>
-      </w:r>
-    </w:p>
-    <w:p>
-      <w:pPr>
-        <w:jc w:val="both"/>
-      </w:pPr>
-      <w:r>
-        <w:t>ПАО «ВУШ Холдинг». Whoosh опубликовал операционные результаты за 2025 год [Электронный ресурс]. – 2026. – URL: https://news.whoosh-bike.ru/Whoosh_opublikoval_operatsionnyye_rezultaty_za_2025_god (дата обращения: 15.05.2026).</w:t>
-      </w:r>
-    </w:p>
-    <w:p>
-      <w:pPr>
-        <w:jc w:val="both"/>
-      </w:pPr>
-      <w:r>
-        <w:t>ПАО «ВУШ Холдинг». Whoosh публикует операционные результаты за 12 месяцев 2024 года [Электронный ресурс]. – 2025. – URL: https://news.whoosh-bike.ru/whoosh2024 (дата обращения: 14.03.2026).</w:t>
-      </w:r>
-    </w:p>
-    <w:p>
-      <w:pPr>
-        <w:jc w:val="both"/>
-      </w:pPr>
-      <w:r>
-        <w:t>ПАО «ВУШ Холдинг». Whoosh публикует операционные результаты за 6 месяцев 2025 года [Электронный ресурс]. – 2025. – URL: https://news.whoosh-bike.ru/operations_6_m_2025_latin_america (дата обращения: 15.05.2026).</w:t>
-      </w:r>
-    </w:p>
-    <w:p>
-      <w:pPr>
-        <w:jc w:val="both"/>
-      </w:pPr>
-      <w:r>
-        <w:t>ПАО «ВУШ Холдинг». Whoosh публикует финансовые результаты за 2024 год [Электронный ресурс]. – 2025. – URL: https://news.whoosh-bike.ru/whoosh_2024 (дата обращения: 14.03.2026).</w:t>
-      </w:r>
-    </w:p>
-    <w:p>
-      <w:pPr>
-        <w:jc w:val="both"/>
-      </w:pPr>
-      <w:r>
-        <w:t>ПАО «ВУШ Холдинг». Whoosh публикует финансовые результаты за 2025 год [Электронный ресурс]. – 2026. – URL: https://news.whoosh-bike.ru/Whoosh_publikuyet_finansovyye_rezultaty_za_2025_god (дата обращения: 14.03.2026).</w:t>
-      </w:r>
-    </w:p>
-    <w:p>
-      <w:pPr>
-        <w:jc w:val="both"/>
-      </w:pPr>
-      <w:r>
-        <w:t>ПАО «ВУШ Холдинг». Whoosh публикует финансовые результаты за 3 квартал и 9 месяцев 2025 года [Электронный ресурс]. – 2025. – URL: https://www.tbank.ru/invest/social/profile/Whoosh_Official/1334d824-cbd6-4450-9e65-d3b4a81dcd1f/ (дата обращения: 15.05.2026).</w:t>
-      </w:r>
-    </w:p>
-    <w:p>
-      <w:pPr>
-        <w:jc w:val="both"/>
-      </w:pPr>
-      <w:r>
-        <w:t>ПАО «МТС». Финансовые и операционные результаты Группы МТС за 4 квартал 2023 года: презентация [Электронный ресурс]. – 2024. – URL: https://ir.mts.ru/investors/financial_center/financial_results (дата обращения: 14.03.2026).</w:t>
-      </w:r>
-    </w:p>
-    <w:p>
-      <w:pPr>
-        <w:jc w:val="both"/>
-      </w:pPr>
-      <w:r>
-        <w:t>ПАО «МТС». Финансовые и операционные результаты Группы МТС за 4 квартал 2024 года: пресс-релиз [Электронный ресурс]. – 2025. – URL: https://ir.mts.ru/investors/financial_center/financial_results (дата обращения: 14.03.2026).</w:t>
-      </w:r>
-    </w:p>
-    <w:p>
-      <w:pPr>
-        <w:jc w:val="both"/>
-      </w:pPr>
-      <w:r>
-        <w:t>ПАО «МТС». Финансовые и операционные результаты Группы МТС за 4 квартал 2025 года: пресс-релиз [Электронный ресурс]. – 2026. – URL: https://ir.mts.ru/investors/financial_center/financial_results (дата обращения: 14.03.2026).</w:t>
-      </w:r>
-    </w:p>
-    <w:p>
-      <w:pPr>
-        <w:jc w:val="both"/>
-      </w:pPr>
-      <w:r>
-        <w:t>Трушеринг. 31,2 млрд рублей и 281,6 млн поездок за сезон. Кикшеринг в России 2024 [Электронный ресурс]. 2025. 18 апр. URL: https://truesharing.ru/tp/54173/ (дата обращения: 11.03.2026).</w:t>
-      </w:r>
-    </w:p>
-    <w:p>
-      <w:pPr>
-        <w:jc w:val="both"/>
-      </w:pPr>
-      <w:r>
-        <w:t>Трушеринг. Комитет по транспорту Санкт-Петербурга и операторы кикшеринга заключили обновлённое соглашение о правилах работы в городе [Электронный ресурс]. 2025. 27 мар. URL: https://truesharing.ru/news/53573/ (дата обращения: 21.02.2026).</w:t>
-      </w:r>
-    </w:p>
-    <w:p>
-      <w:pPr>
-        <w:jc w:val="both"/>
-      </w:pPr>
-      <w:r>
-        <w:t>Эксперт. В России спрос на аренду самокатов снизился на 6 % [Электронный ресурс]. – 2025. – URL: https://expert.ru/news/v-rossii-spros-na-arendu-samokatov-snizilsya-na-6/ (дата обращения: 15.05.2026).</w:t>
+        <w:t>Aarhaug J., Fearnley N., Hartveit K. J. L., Johnsson E. Price and competition in emerging shared e-scooter markets // Research in Transportation Economics. 2023. Vol. 98. Art. 101303. DOI: 10,1016/j.retrec.2023,101303.</w:t>
+      </w:r>
+    </w:p>
+    <w:p>
+      <w:pPr>
+        <w:jc w:val="both"/>
+      </w:pPr>
+      <w:r>
+        <w:t>Aarhaug J., Fearnley N., Johnsson E. E-scooters and public transport – Complement or competition? // Research in Transportation Economics. 2023. Vol. 98. Art. 101279. DOI: 10,1016/j.retrec.2023,101279.</w:t>
+      </w:r>
+    </w:p>
+    <w:p>
+      <w:pPr>
+        <w:jc w:val="both"/>
+      </w:pPr>
+      <w:r>
+        <w:t>Abduljabbar R. L., Liyanage S., Dia H. The role of micro-mobility in shaping sustainable cities: A systematic literature review // Transportation Research Part D: Transport and Environment. 2021. Vol. 92. Art. 102734. DOI: 10,1016/j.trd.2021,102734.</w:t>
+      </w:r>
+    </w:p>
+    <w:p>
+      <w:pPr>
+        <w:jc w:val="both"/>
+      </w:pPr>
+      <w:r>
+        <w:t>Bobičić O., Esztergar-Kiss D. Enablers and barriers to micromobility adoption: Urban and suburban contexts // Sustainable Cities and Society. 2024. Vol. 111. Art. 105595. DOI: 10,1016/j.scs.2024,105595.</w:t>
+      </w:r>
+    </w:p>
+    <w:p>
+      <w:pPr>
+        <w:jc w:val="both"/>
+      </w:pPr>
+      <w:r>
+        <w:t>Carney M., Dieleman M., Taussig M. How are institutional capabilities transferred across borders? // Journal of World Business. 2016. Vol. 51, no. 6. P. 882–894. DOI: 10,1016/j.jwb.2015,12.002.</w:t>
+      </w:r>
+    </w:p>
+    <w:p>
+      <w:pPr>
+        <w:jc w:val="both"/>
+      </w:pPr>
+      <w:r>
+        <w:t>Cennamo C. Competing in Digital Markets: A Platform-Based Perspective // Academy of Management Perspectives. 2021. Vol. 35, no. 2. P. 265–291. DOI: 10,5465/amp.2016,0048.</w:t>
+      </w:r>
+    </w:p>
+    <w:p>
+      <w:pPr>
+        <w:jc w:val="both"/>
+      </w:pPr>
+      <w:r>
+        <w:t>Cennamo C., Santalo J. Platform competition: Strategic trade-offs in platform markets // Strategic Management Journal. 2013. Vol. 34, no. 11. P. 1331–1350. DOI: 10,1002/smj.2066.</w:t>
+      </w:r>
+    </w:p>
+    <w:p>
+      <w:pPr>
+        <w:jc w:val="both"/>
+      </w:pPr>
+      <w:r>
+        <w:t>Coenegrachts E., Vanelslander T., Verhetsel A., Beckers J. Analyzing shared mobility markets in Europe: A comparative analysis of shared mobility schemes across 311 European cities // Journal of Transport Geography. 2024. Vol. 118. Art. 103918. DOI: 10,1016/j.jtrangeo.2024,103918.</w:t>
+      </w:r>
+    </w:p>
+    <w:p>
+      <w:pPr>
+        <w:jc w:val="both"/>
+      </w:pPr>
+      <w:r>
+        <w:t>Coenegrachts E., Vanelslander T., Verhetsel A., Beckers J. Understanding the key criteria for shared mobility providers in their evaluation of potential markets // Journal of Urban Mobility. 2025. Vol. 7. Art. 100115. DOI: 10,1016/j.urbmob.2025,100115.</w:t>
+      </w:r>
+    </w:p>
+    <w:p>
+      <w:pPr>
+        <w:jc w:val="both"/>
+      </w:pPr>
+      <w:r>
+        <w:t>Dias G., Ribeiro P., Arsénio E. Determinants of shared e-scooter usage and their policy implications: Findings from a survey in Braga, Portugal // European Transport Research Review. 2024. Vol. 16. Art. 20. DOI: 10,1186/s12544-024-00642-4.</w:t>
+      </w:r>
+    </w:p>
+    <w:p>
+      <w:pPr>
+        <w:jc w:val="both"/>
+      </w:pPr>
+      <w:r>
+        <w:t>Gábor Š., Novotný L., Pregi L. Revealing Spatial Patterns of Dockless Shared Micromobility: A Case Study of Košice, Slovakia // Urban Science. 2025. Vol. 9, no. 4. Art. 107. DOI: 10,3390/urbansci9040107.</w:t>
+      </w:r>
+    </w:p>
+    <w:p>
+      <w:pPr>
+        <w:jc w:val="both"/>
+      </w:pPr>
+      <w:r>
+        <w:t>Garus A., Dadashev G., Ciuffo B., Nahmias-Biran B. H. Urban Micromobility in Practice: Insights from a Full-Year Analysis of Shared Scooter Use in Tel Aviv // Smart Cities. 2025. Vol. 8, no. 6. Art. 207. DOI: 10,3390/smartcities8060207.</w:t>
+      </w:r>
+    </w:p>
+    <w:p>
+      <w:pPr>
+        <w:jc w:val="both"/>
+      </w:pPr>
+      <w:r>
+        <w:t>Groth S., Ahlmeyer F., Albrecht J., Gerten C., Klinger T., Novack T. Uneven development in market-based supplies of new micromobility services: The case of new e-scooter services // npj Sustainable Mobility and Transport. 2025. Vol. 2. Art. 41. DOI: 10,1038/s44333-025-00060-6.</w:t>
+      </w:r>
+    </w:p>
+    <w:p>
+      <w:pPr>
+        <w:jc w:val="both"/>
+      </w:pPr>
+      <w:r>
+        <w:t>Interfax. Топ-менеджер МТС: электросамокаты становятся утилитарным транспортом, вписываясь в логику стратегии группы [Электронный ресурс]. 2024. 15 янв. URL: https://www.interfax.ru/interview/940294 (дата обращения: 18,01.2026).</w:t>
+      </w:r>
+    </w:p>
+    <w:p>
+      <w:pPr>
+        <w:jc w:val="both"/>
+      </w:pPr>
+      <w:r>
+        <w:t>Li A., Gao K., Zhao P., Axhausen K. W. Integrating shared e-scooters as the feeder to public transit: A comparative analysis of 124 European cities // Research in Transportation Economics. 2023. Vol. 99. Art. 101302. DOI: 10,1016/j.retrec.2023,101302.</w:t>
+      </w:r>
+    </w:p>
+    <w:p>
+      <w:pPr>
+        <w:jc w:val="both"/>
+      </w:pPr>
+      <w:r>
+        <w:t>Mitra R., Hess P. M. Who are the potential users of shared e-scooters? An examination of socio-demographic, attitudinal and environmental factors // Travel Behaviour and Society. 2021. Vol. 23. P. 100–107. DOI: 10,1016/j.tbs.2020,12.009.</w:t>
+      </w:r>
+    </w:p>
+    <w:p>
+      <w:pPr>
+        <w:jc w:val="both"/>
+      </w:pPr>
+      <w:r>
+        <w:t>Moran M. E. Drawing the map: The creation and regulation of geographic constraints on shared bikes and e-scooters in San Francisco, CA // Journal of Transport and Land Use. 2021. Vol. 14, no. 1. P. 459–487. DOI: 10,5198/jtlu.2021,1816.</w:t>
+      </w:r>
+    </w:p>
+    <w:p>
+      <w:pPr>
+        <w:jc w:val="both"/>
+      </w:pPr>
+      <w:r>
+        <w:t>Moran M. E., Laa B., Emberger G. Six scooter operators, six maps: Spatial coverage and regulation of micromobility in Vienna, Austria // Case Studies on Transport Policy. 2020. Vol. 8, no. 4. P. 1001–1011. DOI: 10,1016/j.cstp.2020,03.009.</w:t>
+      </w:r>
+    </w:p>
+    <w:p>
+      <w:pPr>
+        <w:jc w:val="both"/>
+      </w:pPr>
+      <w:r>
+        <w:t>NACTO. Shared Micromobility in the U.S.: 2019 [Электронный ресурс]. New York: National Association of City Transportation Officials, 2020. URL: https://nacto.org/wp-content/uploads/2020bikesharesnapshot.pdf (дата обращения: 19,02.2026).</w:t>
+      </w:r>
+    </w:p>
+    <w:p>
+      <w:pPr>
+        <w:jc w:val="both"/>
+      </w:pPr>
+      <w:r>
+        <w:t>NACTO. Shared Micromobility in the U.S. and Canada: 2023 [Электронный ресурс]. New York: National Association of City Transportation Officials, 2024. URL: https://nacto.org/publication/shared-micromobility-report-2023/ (дата обращения: 19,02.2026).</w:t>
+      </w:r>
+    </w:p>
+    <w:p>
+      <w:pPr>
+        <w:jc w:val="both"/>
+      </w:pPr>
+      <w:r>
+        <w:t>POLIS Governance &amp; Integration Working Group. Careful What You Wish For: Practical Implications of Rules &amp; Requirements for Shared Micromobility [Электронный ресурс]. Brussels: POLIS, 2025. URL: https://www.polisnetwork.eu/wp-content/uploads/2025/03/Shared-Micromobility-Regulations-Report.pdf (дата обращения: 11,03.2026).</w:t>
+      </w:r>
+    </w:p>
+    <w:p>
+      <w:pPr>
+        <w:jc w:val="both"/>
+      </w:pPr>
+      <w:r>
+        <w:t>Rietveld J., Schilling M. A. Platform Competition: A Systematic and Interdisciplinary Review of the Literature // Journal of Management. 2021. Vol. 47, no. 6. P. 1528–1563. DOI: 10,1177/0149206320969791.</w:t>
+      </w:r>
+    </w:p>
+    <w:p>
+      <w:pPr>
+        <w:jc w:val="both"/>
+      </w:pPr>
+      <w:r>
+        <w:t>Sareen S., Remme D., Haarstad H. E-scooter regulation: The micro-politics of market-making for micro-mobility in Bergen // Environmental Innovation and Societal Transitions. 2021. Vol. 40. P. 461–473. DOI: 10,1016/j.eist.2021,10.004.</w:t>
+      </w:r>
+    </w:p>
+    <w:p>
+      <w:pPr>
+        <w:jc w:val="both"/>
+      </w:pPr>
+      <w:r>
+        <w:t>Shah N. R., Ziedan A., Brakewood C., Cherry C. Shared e-scooter service providers with large fleet size have a competitive advantage: Findings from e-scooter demand and supply analysis of Nashville, Tennessee [Электронный ресурс] // SSRN Electronic Journal. 2022. Preprint. URL: https://ssrn.com/abstract=4167543 (дата обращения: 04,03.2026).</w:t>
+      </w:r>
+    </w:p>
+    <w:p>
+      <w:pPr>
+        <w:jc w:val="both"/>
+      </w:pPr>
+      <w:r>
+        <w:t>Teece D. J., Pisano G., Shuen A. Dynamic Capabilities and Strategic Management // Strategic Management Journal. 1997. Vol. 18, no. 7. P. 509–533. DOI: 10,1002/(SICI)1097-0266(199708)18:7&lt;509::AID-SMJ882&gt;3,0.CO;2-Z.</w:t>
+      </w:r>
+    </w:p>
+    <w:p>
+      <w:pPr>
+        <w:jc w:val="both"/>
+      </w:pPr>
+      <w:r>
+        <w:t>Департамент транспорта и развития дорожно-транспортной инфраструктуры города Москвы. Новые правила для аренды электросамокатов начнут действовать в новом сезоне проката [Электронный ресурс]. 2025. 10 февр. URL: https://transport.mos.ru/mostrans/all_news/123241 (дата обращения: 26,02.2026).</w:t>
+      </w:r>
+    </w:p>
+    <w:p>
+      <w:pPr>
+        <w:jc w:val="both"/>
+      </w:pPr>
+      <w:r>
+        <w:t>Иволгин А. В каких городах-миллионниках больше ездят на электросамокатах и сколько тратят самые активные пользователи [Электронный ресурс] // Т–Ж. 2024. 3 дек. URL: https://t-j.ru/kicksharing-stat/ (дата обращения: 27,02.2026).</w:t>
+      </w:r>
+    </w:p>
+    <w:p>
+      <w:pPr>
+        <w:jc w:val="both"/>
+      </w:pPr>
+      <w:r>
+        <w:t>Коммерсантъ. Кикшеринговым компаниям в Екатеринбурге пригрозили расторжением договоров [Электронный ресурс]. 2025. 11 апр. URL: https://www.kommersant.ru/doc/7655884 (дата обращения: 27,02.2026).</w:t>
+      </w:r>
+    </w:p>
+    <w:p>
+      <w:pPr>
+        <w:jc w:val="both"/>
+      </w:pPr>
+      <w:r>
+        <w:t>ПАО «ВУШ Холдинг». Whoosh опубликовал операционные результаты за 2025 год [Электронный ресурс]. – 2026. – URL: https://news.whoosh-bike.ru/Whoosh_opublikoval_operatsionnyye_rezultaty_za_2025_god (дата обращения: 15,05.2026).</w:t>
+      </w:r>
+    </w:p>
+    <w:p>
+      <w:pPr>
+        <w:jc w:val="both"/>
+      </w:pPr>
+      <w:r>
+        <w:t>ПАО «ВУШ Холдинг». Whoosh публикует операционные результаты за 12 месяцев 2024 года [Электронный ресурс]. – 2025. – URL: https://news.whoosh-bike.ru/whoosh2024 (дата обращения: 14,03.2026).</w:t>
+      </w:r>
+    </w:p>
+    <w:p>
+      <w:pPr>
+        <w:jc w:val="both"/>
+      </w:pPr>
+      <w:r>
+        <w:t>ПАО «ВУШ Холдинг». Whoosh публикует операционные результаты за 6 месяцев 2025 года [Электронный ресурс]. – 2025. – URL: https://news.whoosh-bike.ru/operations_6_m_2025_latin_america (дата обращения: 15,05.2026).</w:t>
+      </w:r>
+    </w:p>
+    <w:p>
+      <w:pPr>
+        <w:jc w:val="both"/>
+      </w:pPr>
+      <w:r>
+        <w:t>ПАО «ВУШ Холдинг». Whoosh публикует финансовые результаты за 2024 год [Электронный ресурс]. – 2025. – URL: https://news.whoosh-bike.ru/whoosh_2024 (дата обращения: 14,03.2026).</w:t>
+      </w:r>
+    </w:p>
+    <w:p>
+      <w:pPr>
+        <w:jc w:val="both"/>
+      </w:pPr>
+      <w:r>
+        <w:t>ПАО «ВУШ Холдинг». Whoosh публикует финансовые результаты за 2025 год [Электронный ресурс]. – 2026. – URL: https://news.whoosh-bike.ru/Whoosh_publikuyet_finansovyye_rezultaty_za_2025_god (дата обращения: 14,03.2026).</w:t>
+      </w:r>
+    </w:p>
+    <w:p>
+      <w:pPr>
+        <w:jc w:val="both"/>
+      </w:pPr>
+      <w:r>
+        <w:t>ПАО «ВУШ Холдинг». Whoosh публикует финансовые результаты за 3 квартал и 9 месяцев 2025 года [Электронный ресурс]. – 2025. – URL: https://www.tbank.ru/invest/social/profile/Whoosh_Official/1334d824-cbd6-4450-9e65-d3b4a81dcd1f/ (дата обращения: 15,05.2026).</w:t>
+      </w:r>
+    </w:p>
+    <w:p>
+      <w:pPr>
+        <w:jc w:val="both"/>
+      </w:pPr>
+      <w:r>
+        <w:t>ПАО «МТС». Финансовые и операционные результаты Группы МТС за 4 квартал 2023 года: презентация [Электронный ресурс]. – 2024. – URL: https://ir.mts.ru/investors/financial_center/financial_results (дата обращения: 14,03.2026).</w:t>
+      </w:r>
+    </w:p>
+    <w:p>
+      <w:pPr>
+        <w:jc w:val="both"/>
+      </w:pPr>
+      <w:r>
+        <w:t>ПАО «МТС». Финансовые и операционные результаты Группы МТС за 4 квартал 2024 года: пресс-релиз [Электронный ресурс]. – 2025. – URL: https://ir.mts.ru/investors/financial_center/financial_results (дата обращения: 14,03.2026).</w:t>
+      </w:r>
+    </w:p>
+    <w:p>
+      <w:pPr>
+        <w:jc w:val="both"/>
+      </w:pPr>
+      <w:r>
+        <w:t>ПАО «МТС». Финансовые и операционные результаты Группы МТС за 4 квартал 2025 года: пресс-релиз [Электронный ресурс]. – 2026. – URL: https://ir.mts.ru/investors/financial_center/financial_results (дата обращения: 14,03.2026).</w:t>
+      </w:r>
+    </w:p>
+    <w:p>
+      <w:pPr>
+        <w:jc w:val="both"/>
+      </w:pPr>
+      <w:r>
+        <w:t>Трушеринг. 31,2 млрд рублей и 281,6 млн поездок за сезон. Кикшеринг в России 2024 [Электронный ресурс]. 2025. 18 апр. URL: https://truesharing.ru/tp/54173/ (дата обращения: 11,03.2026).</w:t>
+      </w:r>
+    </w:p>
+    <w:p>
+      <w:pPr>
+        <w:jc w:val="both"/>
+      </w:pPr>
+      <w:r>
+        <w:t>Трушеринг. Комитет по транспорту Санкт-Петербурга и операторы кикшеринга заключили обновлённое соглашение о правилах работы в городе [Электронный ресурс]. 2025. 27 мар. URL: https://truesharing.ru/news/53573/ (дата обращения: 21,02.2026).</w:t>
+      </w:r>
+    </w:p>
+    <w:p>
+      <w:pPr>
+        <w:jc w:val="both"/>
+      </w:pPr>
+      <w:r>
+        <w:t>Эксперт. В России спрос на аренду самокатов снизился на 6 % [Электронный ресурс]. – 2025. – URL: https://expert.ru/news/v-rossii-spros-na-arendu-samokatov-snizilsya-na-6/ (дата обращения: 15,05.2026).</w:t>
       </w:r>
     </w:p>
     <w:p>
@@ -7945,7 +7945,7 @@
         <w:jc w:val="both"/>
       </w:pPr>
       <w:r>
-        <w:t>1. Поиск и навигация по литературе. Поиск релевантных академических источников по тематике микромобильности, ресурсной теории фирмы, динамических способностей, платформенной конкуренции, регулирования СИМ; первичная фильтрация результатов поиска. Все процитированные источники проверены автором по оригинальным публикациям; библиографические записи в Списке литературы оформлены автором по ГОСТ 7.0.5–2008. Эффективность: сокращение времени поиска источников приблизительно на 40 % относительно ручного.</w:t>
+        <w:t>1. Поиск и навигация по литературе. Поиск релевантных академических источников по тематике микромобильности, ресурсной теории фирмы, динамических способностей, платформенной конкуренции, регулирования СИМ; первичная фильтрация результатов поиска. Все процитированные источники проверены автором по оригинальным публикациям; библиографические записи в Списке литературы оформлены автором по ГОСТ 7,0.5–2008. Эффективность: сокращение времени поиска источников приблизительно на 40 % относительно ручного.</w:t>
       </w:r>
     </w:p>
     <w:p>
@@ -7969,7 +7969,7 @@
         <w:jc w:val="both"/>
       </w:pPr>
       <w:r>
-        <w:t>4. Оформление библиографических записей. Перевод сырых ссылок в формат ГОСТ 7.0.5–2008; авторская сверка деталей выходных данных по оригиналам публикаций. Эффективность: высокая.</w:t>
+        <w:t>4. Оформление библиографических записей. Перевод сырых ссылок в формат ГОСТ 7,0.5–2008; авторская сверка деталей выходных данных по оригиналам публикаций. Эффективность: высокая.</w:t>
       </w:r>
     </w:p>
     <w:p>

</xml_diff>

<commit_message>
Remove bullets, add missing references, replace doubtful sources
- Заменил все буллет-списки (●) на дефисы (–) или инлайн через ;
- Добавил недостающие реальные источники в библиографию:
  * Wernerfelt 1984, Barney 1991, Teece 2007, Reed & DeFillippi 1990
  * Hollingsworth et al. 2019, Johnson et al. 2017
  * Клейнер 2013, Клейнер 2021
- Удалил/заменил недокументированные ссылки:
  * Riggs et al. 2025 → Dias/Bobičić (уже в библ.)
  * Du et al. 2024 → [сценарное допущение, оценка автора]
  * Groth, Schwarz, Marquardt 2024 → Groth et al. 2025 (уже в библ.)
- Пересобран VKR_final.docx

Co-authored-by: alalolop3-hue <alalolop3-hue@users.noreply.github.com>
</commit_message>
<xml_diff>
--- a/vkr/VKR_final.docx
+++ b/vkr/VKR_final.docx
@@ -541,52 +541,42 @@
     </w:p>
     <w:p>
       <w:pPr>
-        <w:pStyle w:val="ListBullet"/>
-        <w:spacing w:line="360" w:lineRule="auto"/>
-        <w:ind w:firstLine="0" w:left="709"/>
-      </w:pPr>
-      <w:r>
-        <w:t>анализ документов: ежеквартальные пресс-релизы и презентации ПАО «МТС» за 2022–2025 гг., годовой отчёт ПАО «МТС» за 2023 год, финансовая и операционная отчётность ПАО «ВУШ Холдинг» по МСФО за 2022–2025 гг.;</w:t>
-      </w:r>
-    </w:p>
-    <w:p>
-      <w:pPr>
-        <w:pStyle w:val="ListBullet"/>
-        <w:spacing w:line="360" w:lineRule="auto"/>
-        <w:ind w:firstLine="0" w:left="709"/>
-      </w:pPr>
-      <w:r>
-        <w:t>вторичный анализ отраслевой аналитики (TrueSharing, деловая пресса, отчёты международных урбанистических ассоциаций NACTO и ITDP);</w:t>
-      </w:r>
-    </w:p>
-    <w:p>
-      <w:pPr>
-        <w:pStyle w:val="ListBullet"/>
-        <w:spacing w:line="360" w:lineRule="auto"/>
-        <w:ind w:firstLine="0" w:left="709"/>
-      </w:pPr>
-      <w:r>
-        <w:t>экспертные консультации с двумя информантами: экспертом А. (руководитель подразделения M&amp;A ПАО «МТС»; экспертная консультация); экспертом Б. (отраслевой эксперт с многолетним опытом топ-уровня в ПАО «МТС», в настоящее время</w:t>
-      </w:r>
-    </w:p>
-    <w:p>
-      <w:pPr>
-        <w:pStyle w:val="ListBullet"/>
-        <w:spacing w:line="360" w:lineRule="auto"/>
-        <w:ind w:firstLine="0" w:left="709"/>
-      </w:pPr>
-      <w:r>
-        <w:t>научный руководитель ВКР; ). Основные содержательные выводы работы строятся на публичных данных и на консультации с экспертом А.; эксперту Б. в эмпирической базе ВКР отведена калибровочная функция</w:t>
-      </w:r>
-    </w:p>
-    <w:p>
-      <w:pPr>
-        <w:pStyle w:val="ListBullet"/>
-        <w:spacing w:line="360" w:lineRule="auto"/>
-        <w:ind w:firstLine="0" w:left="709"/>
-      </w:pPr>
-      <w:r>
-        <w:t>проверка логики выводов и сверка интерпретаций со взглядом отраслевого практика. Тематические блоки гида интервью: стадия рынка и его зрелость; конкурентное поле и ключевые факторы успеха; региональная неоднородность; ограничения и возможности МТС Юрент; технологический выбор и операционная модель. Гид интервью и расшифровки в согласованной мере раскрытия приведены в Приложении Б.</w:t>
+        <w:jc w:val="both"/>
+      </w:pPr>
+      <w:r>
+        <w:t>– анализ документов: ежеквартальные пресс-релизы и презентации ПАО «МТС» за 2022–2025 гг., годовой отчёт ПАО «МТС» за 2023 год, финансовая и операционная отчётность ПАО «ВУШ Холдинг» по МСФО за 2022–2025 гг.;</w:t>
+      </w:r>
+    </w:p>
+    <w:p>
+      <w:pPr>
+        <w:jc w:val="both"/>
+      </w:pPr>
+      <w:r>
+        <w:t>– вторичный анализ отраслевой аналитики (TrueSharing, деловая пресса, отчёты международных урбанистических ассоциаций NACTO и ITDP);</w:t>
+      </w:r>
+    </w:p>
+    <w:p>
+      <w:pPr>
+        <w:jc w:val="both"/>
+      </w:pPr>
+      <w:r>
+        <w:t>– экспертные консультации с двумя информантами: экспертом А. (руководитель подразделения M&amp;A ПАО «МТС»; экспертная консультация); экспертом Б. (отраслевой эксперт с многолетним опытом топ-уровня в ПАО «МТС», в настоящее время</w:t>
+      </w:r>
+    </w:p>
+    <w:p>
+      <w:pPr>
+        <w:jc w:val="both"/>
+      </w:pPr>
+      <w:r>
+        <w:t>– научный руководитель ВКР; ). Основные содержательные выводы работы строятся на публичных данных и на консультации с экспертом А.; эксперту Б. в эмпирической базе ВКР отведена калибровочная функция</w:t>
+      </w:r>
+    </w:p>
+    <w:p>
+      <w:pPr>
+        <w:jc w:val="both"/>
+      </w:pPr>
+      <w:r>
+        <w:t>– проверка логики выводов и сверка интерпретаций со взглядом отраслевого практика. Тематические блоки гида интервью: стадия рынка и его зрелость; конкурентное поле и ключевые факторы успеха; региональная неоднородность; ограничения и возможности МТС Юрент; технологический выбор и операционная модель. Гид интервью и расшифровки в согласованной мере раскрытия приведены в Приложении Б.</w:t>
       </w:r>
     </w:p>
     <w:p>
@@ -599,42 +589,34 @@
     </w:p>
     <w:p>
       <w:pPr>
-        <w:pStyle w:val="ListBullet"/>
-        <w:spacing w:line="360" w:lineRule="auto"/>
-        <w:ind w:firstLine="0" w:left="709"/>
-      </w:pPr>
-      <w:r>
-        <w:t>иерархическая декомпозиция факторов регионального различения (I, II и III уровни);</w:t>
-      </w:r>
-    </w:p>
-    <w:p>
-      <w:pPr>
-        <w:pStyle w:val="ListBullet"/>
-        <w:spacing w:line="360" w:lineRule="auto"/>
-        <w:ind w:firstLine="0" w:left="709"/>
-      </w:pPr>
-      <w:r>
-        <w:t>построение каркаса режимов через однородный набор полей описания (цель, условия применения, рычаги, KPI, ограничения);</w:t>
-      </w:r>
-    </w:p>
-    <w:p>
-      <w:pPr>
-        <w:pStyle w:val="ListBullet"/>
-        <w:spacing w:line="360" w:lineRule="auto"/>
-        <w:ind w:firstLine="0" w:left="709"/>
-      </w:pPr>
-      <w:r>
-        <w:t>критериальное сопоставление трёх альтернативных сценариев по пяти критериям, выводимым из теоретико-методологической основы работы;</w:t>
-      </w:r>
-    </w:p>
-    <w:p>
-      <w:pPr>
-        <w:pStyle w:val="ListBullet"/>
-        <w:spacing w:line="360" w:lineRule="auto"/>
-        <w:ind w:firstLine="0" w:left="709"/>
-      </w:pPr>
-      <w:r>
-        <w:t>сопоставление с международным опытом управления зрелыми платформенными рынками (Coenegrachts et al., 2024; Riggs et al., 2025; Shah et al., 2022).</w:t>
+        <w:jc w:val="both"/>
+      </w:pPr>
+      <w:r>
+        <w:t>– иерархическая декомпозиция факторов регионального различения (I, II и III уровни);</w:t>
+      </w:r>
+    </w:p>
+    <w:p>
+      <w:pPr>
+        <w:jc w:val="both"/>
+      </w:pPr>
+      <w:r>
+        <w:t>– построение каркаса режимов через однородный набор полей описания (цель, условия применения, рычаги, KPI, ограничения);</w:t>
+      </w:r>
+    </w:p>
+    <w:p>
+      <w:pPr>
+        <w:jc w:val="both"/>
+      </w:pPr>
+      <w:r>
+        <w:t>– критериальное сопоставление трёх альтернативных сценариев по пяти критериям, выводимым из теоретико-методологической основы работы;</w:t>
+      </w:r>
+    </w:p>
+    <w:p>
+      <w:pPr>
+        <w:jc w:val="both"/>
+      </w:pPr>
+      <w:r>
+        <w:t>– сопоставление с международным опытом управления зрелыми платформенными рынками (Coenegrachts et al., 2024; Shah et al., 2022; Bobičić, Esztergar-Kiss, 2024).</w:t>
       </w:r>
     </w:p>
     <w:p>
@@ -647,22 +629,18 @@
     </w:p>
     <w:p>
       <w:pPr>
-        <w:pStyle w:val="ListBullet"/>
-        <w:spacing w:line="360" w:lineRule="auto"/>
-        <w:ind w:firstLine="0" w:left="709"/>
-      </w:pPr>
-      <w:r>
-        <w:t>расчёт удельной юнит-экономики бенчмарк-оператора (ПАО «ВУШ Холдинг», российская часть бизнеса): выручка на поездку, выручка на единицу СИМ в год, количество поездок на СИМ в год, рентабельность по EBITDA кикшеринга;</w:t>
-      </w:r>
-    </w:p>
-    <w:p>
-      <w:pPr>
-        <w:pStyle w:val="ListBullet"/>
-        <w:spacing w:line="360" w:lineRule="auto"/>
-        <w:ind w:firstLine="0" w:left="709"/>
-      </w:pPr>
-      <w:r>
-        <w:t>сценарное моделирование эффекта проектного решения и эффекта диверсификации режимов на портфеле из 4–5 городов через маржинальную EBITDA-маржу и явно заданные допущения о доле охваченных стимулами поездок, средней величине дисконта и распределении городов по режимам.</w:t>
+        <w:jc w:val="both"/>
+      </w:pPr>
+      <w:r>
+        <w:t>– расчёт удельной юнит-экономики бенчмарк-оператора (ПАО «ВУШ Холдинг», российская часть бизнеса): выручка на поездку, выручка на единицу СИМ в год, количество поездок на СИМ в год, рентабельность по EBITDA кикшеринга;</w:t>
+      </w:r>
+    </w:p>
+    <w:p>
+      <w:pPr>
+        <w:jc w:val="both"/>
+      </w:pPr>
+      <w:r>
+        <w:t>– сценарное моделирование эффекта проектного решения и эффекта диверсификации режимов на портфеле из 4–5 городов через маржинальную EBITDA-маржу и явно заданные допущения о доле охваченных стимулами поездок, средней величине дисконта и распределении городов по режимам.</w:t>
       </w:r>
     </w:p>
     <w:p>
@@ -710,7 +688,7 @@
         <w:jc w:val="both"/>
       </w:pPr>
       <w:r>
-        <w:t>Четвёртая – эмпирические исследования критериев выбора рынков шеринговой микромобильности (Riggs et al., 2025; Coenegrachts et al., 2024; Shah et al., 2022) – используются для калибровки модели регионального различения и выбора рычагов внутри режимов.</w:t>
+        <w:t>Четвёртая – эмпирические исследования критериев выбора рынков шеринговой микромобильности (Coenegrachts et al., 2024; Shah et al., 2022; Bobičić, Esztergar-Kiss, 2024) – используются для калибровки модели регионального различения и выбора рычагов внутри режимов.</w:t>
       </w:r>
     </w:p>
     <w:p>
@@ -971,7 +949,7 @@
         <w:jc w:val="both"/>
       </w:pPr>
       <w:r>
-        <w:t>Особенно полезным в этой связи оказывается понятие uneven development – неравномерного развития рынка, проявляющегося не только в темпах расширения парка, но и в самом процессе рыночного формирования. Исследование Groth et al. по новым сервисам аренды электросамокатов в Германии показывает, что развитие рынка в рыночных условиях носит социально- и пространственно-избирательный характер: не все территории становятся одинаково привлекательными или достижимыми для операторов, а доступ к сервису неравномерно распределяется между группами пользователей и районами города (Groth, Schwarz, Marquardt, 2024). Coenegrachts et al. дополняют этот вывод: даже при формальном сходстве городов локальные операторы и условия рынка могут существенно различаться, а жёсткость регулирования и институциональные условия заметно влияют на стратегии операторов (Coenegrachts et al., 2024).</w:t>
+        <w:t>Особенно полезным в этой связи оказывается понятие uneven development – неравномерного развития рынка, проявляющегося не только в темпах расширения парка, но и в самом процессе рыночного формирования. Исследование Groth et al. по новым сервисам аренды электросамокатов в Германии показывает, что развитие рынка в рыночных условиях носит социально- и пространственно-избирательный характер: не все территории становятся одинаково привлекательными или достижимыми для операторов, а доступ к сервису неравномерно распределяется между группами пользователей и районами города (Groth et al., 2025). Coenegrachts et al. дополняют этот вывод: даже при формальном сходстве городов локальные операторы и условия рынка могут существенно различаться, а жёсткость регулирования и институциональные условия заметно влияют на стратегии операторов (Coenegrachts et al., 2024).</w:t>
       </w:r>
     </w:p>
     <w:p>
@@ -1460,7 +1438,7 @@
         <w:jc w:val="both"/>
       </w:pPr>
       <w:r>
-        <w:t>Социальные факторы (S). Кикшеринг востребован как транспорт «последней мили» и рекреационный сервис. Среди критериев выбора оператора для пользователя – близость самоката к текущей точке, цена поездки, качество и удобство приложения (Riggs et al., 2025). Сезонность спроса выражена: 85–90 % поездок приходится на Q2–Q3 (апрель–сентябрь). Демографический профиль пользователей – городское население 18–35 лет. Утилизация парка различается в 4 раза между городами (Москва – 1 073 п/с/год, Новосибирск – 277), отражая неоднородность спроса. Влияние на стратегический выбор: среднее. Сезонность и локальность спроса усиливают значимость операционных инструментов управления покрытием (УПС), но не определяют выбор между сценариями напрямую.</w:t>
+        <w:t>Социальные факторы (S). Кикшеринг востребован как транспорт «последней мили» и рекреационный сервис. Среди критериев выбора оператора для пользователя – близость самоката к текущей точке, цена поездки, качество и удобство приложения (Dias, Ribeiro, Arsénio, 2024; Bobičić, Esztergar-Kiss, 2024). Сезонность спроса выражена: 85–90 % поездок приходится на Q2–Q3 (апрель–сентябрь). Демографический профиль пользователей – городское население 18–35 лет. Утилизация парка различается в 4 раза между городами (Москва – 1 073 п/с/год, Новосибирск – 277), отражая неоднородность спроса. Влияние на стратегический выбор: среднее. Сезонность и локальность спроса усиливают значимость операционных инструментов управления покрытием (УПС), но не определяют выбор между сценариями напрямую.</w:t>
       </w:r>
     </w:p>
     <w:p>
@@ -3032,42 +3010,34 @@
     </w:p>
     <w:p>
       <w:pPr>
-        <w:pStyle w:val="ListBullet"/>
-        <w:spacing w:line="360" w:lineRule="auto"/>
-        <w:ind w:firstLine="0" w:left="709"/>
-      </w:pPr>
-      <w:r>
-        <w:t>интеграция в экосистему ПАО «МТС»: доступ к клиентской базе ~80 млн абонентов, единый MTS ID, экосистемные каналы коммуникации, подписочная модель через МТС Premium, обезличенная геоаналитика;</w:t>
-      </w:r>
-    </w:p>
-    <w:p>
-      <w:pPr>
-        <w:pStyle w:val="ListBullet"/>
-        <w:spacing w:line="360" w:lineRule="auto"/>
-        <w:ind w:firstLine="0" w:left="709"/>
-      </w:pPr>
-      <w:r>
-        <w:t>технологический контур: собственная разрабатываемая платформа после приобретения Eleven, телематика парка, базовая инфраструктура push-стимулирования (предпосылка УПС);</w:t>
-      </w:r>
-    </w:p>
-    <w:p>
-      <w:pPr>
-        <w:pStyle w:val="ListBullet"/>
-        <w:spacing w:line="360" w:lineRule="auto"/>
-        <w:ind w:firstLine="0" w:left="709"/>
-      </w:pPr>
-      <w:r>
-        <w:t>операционная база: парк ~120 тыс. СИМ, присутствие в 187 локациях, отстроенные процедуры обслуживания и приложение с действующей пользовательской базой;</w:t>
-      </w:r>
-    </w:p>
-    <w:p>
-      <w:pPr>
-        <w:pStyle w:val="ListBullet"/>
-        <w:spacing w:line="360" w:lineRule="auto"/>
-        <w:ind w:firstLine="0" w:left="709"/>
-      </w:pPr>
-      <w:r>
-        <w:t>предпринимательская гибкость: компактная команда, короткий контур принятия решений, готовность пилотировать продуктовые механики.</w:t>
+        <w:jc w:val="both"/>
+      </w:pPr>
+      <w:r>
+        <w:t>– интеграция в экосистему ПАО «МТС»: доступ к клиентской базе ~80 млн абонентов, единый MTS ID, экосистемные каналы коммуникации, подписочная модель через МТС Premium, обезличенная геоаналитика;</w:t>
+      </w:r>
+    </w:p>
+    <w:p>
+      <w:pPr>
+        <w:jc w:val="both"/>
+      </w:pPr>
+      <w:r>
+        <w:t>– технологический контур: собственная разрабатываемая платформа после приобретения Eleven, телематика парка, базовая инфраструктура push-стимулирования (предпосылка УПС);</w:t>
+      </w:r>
+    </w:p>
+    <w:p>
+      <w:pPr>
+        <w:jc w:val="both"/>
+      </w:pPr>
+      <w:r>
+        <w:t>– операционная база: парк ~120 тыс. СИМ, присутствие в 187 локациях, отстроенные процедуры обслуживания и приложение с действующей пользовательской базой;</w:t>
+      </w:r>
+    </w:p>
+    <w:p>
+      <w:pPr>
+        <w:jc w:val="both"/>
+      </w:pPr>
+      <w:r>
+        <w:t>– предпринимательская гибкость: компактная команда, короткий контур принятия решений, готовность пилотировать продуктовые механики.</w:t>
       </w:r>
     </w:p>
     <w:p>
@@ -3080,42 +3050,34 @@
     </w:p>
     <w:p>
       <w:pPr>
-        <w:pStyle w:val="ListBullet"/>
-        <w:spacing w:line="360" w:lineRule="auto"/>
-        <w:ind w:firstLine="0" w:left="709"/>
-      </w:pPr>
-      <w:r>
-        <w:t>централизованная управленческая логика: продуктовые, маркетинговые и операционные решения принимаются преимущественно из центра, что снижает чувствительность к различиям между региональными рынками;</w:t>
-      </w:r>
-    </w:p>
-    <w:p>
-      <w:pPr>
-        <w:pStyle w:val="ListBullet"/>
-        <w:spacing w:line="360" w:lineRule="auto"/>
-        <w:ind w:firstLine="0" w:left="709"/>
-      </w:pPr>
-      <w:r>
-        <w:t>слабая формализация регионального управления: отсутствует устойчивая процедура сопоставимого различения городов и назначения режимов присутствия; решения по портфелю принимаются как набор отдельных кейсов (экспертная оценка);</w:t>
-      </w:r>
-    </w:p>
-    <w:p>
-      <w:pPr>
-        <w:pStyle w:val="ListBullet"/>
-        <w:spacing w:line="360" w:lineRule="auto"/>
-        <w:ind w:firstLine="0" w:left="709"/>
-      </w:pPr>
-      <w:r>
-        <w:t>ограниченная локальная управленческая инфраструктура: дефицит выделенных функций региональной экспертизы и координации;</w:t>
-      </w:r>
-    </w:p>
-    <w:p>
-      <w:pPr>
-        <w:pStyle w:val="ListBullet"/>
-        <w:spacing w:line="360" w:lineRule="auto"/>
-        <w:ind w:firstLine="0" w:left="709"/>
-      </w:pPr>
-      <w:r>
-        <w:t>систематическое отставание по операционной эффективности: выручка на самокат и утилизация ниже, чем у Whoosh, что отражает не только размер парка, но и качество управления уже размещёнными активами.</w:t>
+        <w:jc w:val="both"/>
+      </w:pPr>
+      <w:r>
+        <w:t>– централизованная управленческая логика: продуктовые, маркетинговые и операционные решения принимаются преимущественно из центра, что снижает чувствительность к различиям между региональными рынками;</w:t>
+      </w:r>
+    </w:p>
+    <w:p>
+      <w:pPr>
+        <w:jc w:val="both"/>
+      </w:pPr>
+      <w:r>
+        <w:t>– слабая формализация регионального управления: отсутствует устойчивая процедура сопоставимого различения городов и назначения режимов присутствия; решения по портфелю принимаются как набор отдельных кейсов (экспертная оценка);</w:t>
+      </w:r>
+    </w:p>
+    <w:p>
+      <w:pPr>
+        <w:jc w:val="both"/>
+      </w:pPr>
+      <w:r>
+        <w:t>– ограниченная локальная управленческая инфраструктура: дефицит выделенных функций региональной экспертизы и координации;</w:t>
+      </w:r>
+    </w:p>
+    <w:p>
+      <w:pPr>
+        <w:jc w:val="both"/>
+      </w:pPr>
+      <w:r>
+        <w:t>– систематическое отставание по операционной эффективности: выручка на самокат и утилизация ниже, чем у Whoosh, что отражает не только размер парка, но и качество управления уже размещёнными активами.</w:t>
       </w:r>
     </w:p>
     <w:p>
@@ -4290,7 +4252,7 @@
         <w:jc w:val="both"/>
       </w:pPr>
       <w:r>
-        <w:t>Управленческая логика УПС допускает количественную оценку порядка экономического эффекта в формате сценарного расчёта с явно маркированными допущениями. Для расчёта используются отраслевые данные по Екатеринбургу – пилотному рынку демонстрационного портфеля. Парк (6 448 самокатов), поездки (1 819 014 за сезон Q2+Q3), средний чек (75 руб.) и утилизация (319 поездок/самокат/год) взяты из отраслевых данных 2024 г. Операционные расходы калиброваны по публичной отчётности ВУШ Холдинг (МСФО, 9 мес. 2024): OpEx/выручка = 55 % (Whoosh 48 % + 7 п.п. поправка на масштаб). Доля ребалансировки в OpEx = 30 % (Du et al., 2024), стоимость физической ребалансировки = 120 руб./операция (отраслевая оценка). Средневзвешенная стоимость стимула = 26,5 руб., складывается из трёх типов: стимул-высадка (15 руб., 50 % операций), стимул-посадка (10 руб., 30 %), внешний исполнитель (80 руб., 20 %).</w:t>
+        <w:t>Управленческая логика УПС допускает количественную оценку порядка экономического эффекта в формате сценарного расчёта с явно маркированными допущениями. Для расчёта используются отраслевые данные по Екатеринбургу – пилотному рынку демонстрационного портфеля. Парк (6 448 самокатов), поездки (1 819 014 за сезон Q2+Q3), средний чек (75 руб.) и утилизация (319 поездок/самокат/год) взяты из отраслевых данных 2024 г. Операционные расходы калиброваны по публичной отчётности ВУШ Холдинг (МСФО, 9 мес. 2024): OpEx/выручка = 55 % (Whoosh 48 % + 7 п.п. поправка на масштаб). Доля ребалансировки в OpEx ≈ 30 % [сценарное допущение, оценка автора], стоимость физической ребалансировки = 120 руб./операция (отраслевая оценка). Средневзвешенная стоимость стимула = 26,5 руб., складывается из трёх типов: стимул-высадка (15 руб., 50 % операций), стимул-посадка (10 руб., 30 %), внешний исполнитель (80 руб., 20 %).</w:t>
       </w:r>
     </w:p>
     <w:p>
@@ -5390,57 +5352,7 @@
         <w:jc w:val="both"/>
       </w:pPr>
       <w:r>
-        <w:t>Темпы изменения выручки и поездок за 9 месяцев 2025 года относительно 9 месяцев 2024 (по данным эксперта А.) подтверждают неоднородность портфеля:</w:t>
-      </w:r>
-    </w:p>
-    <w:p>
-      <w:pPr>
-        <w:pStyle w:val="ListBullet"/>
-        <w:spacing w:line="360" w:lineRule="auto"/>
-        <w:ind w:firstLine="0" w:left="709"/>
-      </w:pPr>
-      <w:r>
-        <w:t>Москва: выручка -7,9 %, поездки -6,6 % – зрелый регуляторно перегруженный рынок;</w:t>
-      </w:r>
-    </w:p>
-    <w:p>
-      <w:pPr>
-        <w:pStyle w:val="ListBullet"/>
-        <w:spacing w:line="360" w:lineRule="auto"/>
-        <w:ind w:firstLine="0" w:left="709"/>
-      </w:pPr>
-      <w:r>
-        <w:t>Санкт-Петербург: выручка +41,1 %, поездки +42,3 % – рынок с активной фазой атаки и резервом плотности;</w:t>
-      </w:r>
-    </w:p>
-    <w:p>
-      <w:pPr>
-        <w:pStyle w:val="ListBullet"/>
-        <w:spacing w:line="360" w:lineRule="auto"/>
-        <w:ind w:firstLine="0" w:left="709"/>
-      </w:pPr>
-      <w:r>
-        <w:t>Краснодар: выручка -5,6 %, поездки -10,2 % – высокая конкуренция, длинный сезон;</w:t>
-      </w:r>
-    </w:p>
-    <w:p>
-      <w:pPr>
-        <w:pStyle w:val="ListBullet"/>
-        <w:spacing w:line="360" w:lineRule="auto"/>
-        <w:ind w:firstLine="0" w:left="709"/>
-      </w:pPr>
-      <w:r>
-        <w:t>Екатеринбург: выручка -4,3 %, поездки +4,1 % – позиция преследователя с резервом плотности;</w:t>
-      </w:r>
-    </w:p>
-    <w:p>
-      <w:pPr>
-        <w:pStyle w:val="ListBullet"/>
-        <w:spacing w:line="360" w:lineRule="auto"/>
-        <w:ind w:firstLine="0" w:left="709"/>
-      </w:pPr>
-      <w:r>
-        <w:t>Новосибирск: выручка +143,2 %, поездки +128,9 % – фаза активного роста на стадии плацдарм / ранний R2.</w:t>
+        <w:t>Темпы изменения выручки и поездок за 9 месяцев 2025 года относительно 9 месяцев 2024 (по данным эксперта А.) подтверждают неоднородность портфеля. Москва теряет объём (выручка –7,9 %, поездки –6,6 %) — это зрелый регуляторно перегруженный рынок. Санкт-Петербург в активной фазе атаки с резервом плотности (выручка +41,1 %, поездки +42,3 %). Краснодар при длинном сезоне и высокой конкуренции тоже теряет объём (выручка –5,6 %, поездки –10,2 %). Екатеринбург — позиция преследователя с резервом плотности и стагнацией выручки (–4,3 %) при медленно растущих поездках (+4,1 %). Новосибирск находится в фазе активного роста на стадии плацдарм / ранний R2 (выручка +143,2 %, поездки +128,9 %).</w:t>
       </w:r>
     </w:p>
     <w:p>
@@ -6617,27 +6529,7 @@
         <w:jc w:val="both"/>
       </w:pPr>
       <w:r>
-        <w:t>Совокупные затраты на реализацию S3:</w:t>
-      </w:r>
-    </w:p>
-    <w:p>
-      <w:pPr>
-        <w:pStyle w:val="ListBullet"/>
-        <w:spacing w:line="360" w:lineRule="auto"/>
-        <w:ind w:firstLine="0" w:left="709"/>
-      </w:pPr>
-      <w:r>
-        <w:t>Год 1: ~48 млн руб. (в том числе ~8 млн capex);</w:t>
-      </w:r>
-    </w:p>
-    <w:p>
-      <w:pPr>
-        <w:pStyle w:val="ListBullet"/>
-        <w:spacing w:line="360" w:lineRule="auto"/>
-        <w:ind w:firstLine="0" w:left="709"/>
-      </w:pPr>
-      <w:r>
-        <w:t>Год 2 (тиражирование УПС на 3 города при сохранении блоков A, B, D): ~37 млн руб. дополнительно к стандартному операционному бюджету.</w:t>
+        <w:t>Совокупные затраты на реализацию S3: в год 1 — около 48 млн руб. (в том числе ~8 млн capex на инфраструктуру УПС); в год 2 при тиражировании УПС на три дополнительных города R2-кластера и сохранении блоков A, B, D — около 37 млн руб. дополнительно к стандартному операционному бюджету.</w:t>
       </w:r>
     </w:p>
     <w:p>
@@ -7206,37 +7098,7 @@
         <w:jc w:val="both"/>
       </w:pPr>
       <w:r>
-        <w:t>Сценарии чувствительности (диапазон чистого эффекта S3 vs S1, год 1):</w:t>
-      </w:r>
-    </w:p>
-    <w:p>
-      <w:pPr>
-        <w:pStyle w:val="ListBullet"/>
-        <w:spacing w:line="360" w:lineRule="auto"/>
-        <w:ind w:firstLine="0" w:left="709"/>
-      </w:pPr>
-      <w:r>
-        <w:t>Консервативный (нижние границы всех допущений): чистый эффект −5 … +10 млн руб. – риск работы «в ноль» в год 1 при сохранении капвложений в УПС;</w:t>
-      </w:r>
-    </w:p>
-    <w:p>
-      <w:pPr>
-        <w:pStyle w:val="ListBullet"/>
-        <w:spacing w:line="360" w:lineRule="auto"/>
-        <w:ind w:firstLine="0" w:left="709"/>
-      </w:pPr>
-      <w:r>
-        <w:t>Базовый (точечные оценки выше): +29 млн руб.;</w:t>
-      </w:r>
-    </w:p>
-    <w:p>
-      <w:pPr>
-        <w:pStyle w:val="ListBullet"/>
-        <w:spacing w:line="360" w:lineRule="auto"/>
-        <w:ind w:firstLine="0" w:left="709"/>
-      </w:pPr>
-      <w:r>
-        <w:t>Оптимистичный (верхние границы): +70 … +90 млн руб.</w:t>
+        <w:t>Сценарии чувствительности дают диапазон чистого эффекта S3 vs S1 в год 1 от –5 до +10 млн руб. в консервативном варианте (нижние границы всех допущений; риск работы «в ноль» при сохранении капвложений в УПС), +29 млн руб. в базовом сценарии (точечные оценки выше), +70 … +90 млн руб. в оптимистичном (верхние границы).</w:t>
       </w:r>
     </w:p>
     <w:p>
@@ -7281,42 +7143,34 @@
     </w:p>
     <w:p>
       <w:pPr>
-        <w:pStyle w:val="ListBullet"/>
-        <w:spacing w:line="360" w:lineRule="auto"/>
-        <w:ind w:firstLine="0" w:left="709"/>
-      </w:pPr>
-      <w:r>
-        <w:t>KPI 1. Чистый годовой эффект S3 vs S1 (целевой коридор год 1: +20 … +40 млн руб.; год 2: +110 … +135 млн руб.);</w:t>
-      </w:r>
-    </w:p>
-    <w:p>
-      <w:pPr>
-        <w:pStyle w:val="ListBullet"/>
-        <w:spacing w:line="360" w:lineRule="auto"/>
-        <w:ind w:firstLine="0" w:left="709"/>
-      </w:pPr>
-      <w:r>
-        <w:t>KPI 2. Темп выручки YoY в R2-городах (целевое отклонение от S1 не менее +3 п.п. в год 1, +5 п.п. в год 2);</w:t>
-      </w:r>
-    </w:p>
-    <w:p>
-      <w:pPr>
-        <w:pStyle w:val="ListBullet"/>
-        <w:spacing w:line="360" w:lineRule="auto"/>
-        <w:ind w:firstLine="0" w:left="709"/>
-      </w:pPr>
-      <w:r>
-        <w:t>KPI 3. Доля физической ребалансировки в OpEx в R2- и R3-городах (целевое снижение в пилотных городах на 15–25 % за сезон);</w:t>
-      </w:r>
-    </w:p>
-    <w:p>
-      <w:pPr>
-        <w:pStyle w:val="ListBullet"/>
-        <w:spacing w:line="360" w:lineRule="auto"/>
-        <w:ind w:firstLine="0" w:left="709"/>
-      </w:pPr>
-      <w:r>
-        <w:t>KPI 4. EBITDA-маржа сегмента в Москве (целевая стабилизация на горизонте года 1; рост в год 2).</w:t>
+        <w:jc w:val="both"/>
+      </w:pPr>
+      <w:r>
+        <w:t>– KPI 1. Чистый годовой эффект S3 vs S1 (целевой коридор год 1: +20 … +40 млн руб.; год 2: +110 … +135 млн руб.);</w:t>
+      </w:r>
+    </w:p>
+    <w:p>
+      <w:pPr>
+        <w:jc w:val="both"/>
+      </w:pPr>
+      <w:r>
+        <w:t>– KPI 2. Темп выручки YoY в R2-городах (целевое отклонение от S1 не менее +3 п.п. в год 1, +5 п.п. в год 2);</w:t>
+      </w:r>
+    </w:p>
+    <w:p>
+      <w:pPr>
+        <w:jc w:val="both"/>
+      </w:pPr>
+      <w:r>
+        <w:t>– KPI 3. Доля физической ребалансировки в OpEx в R2- и R3-городах (целевое снижение в пилотных городах на 15–25 % за сезон);</w:t>
+      </w:r>
+    </w:p>
+    <w:p>
+      <w:pPr>
+        <w:jc w:val="both"/>
+      </w:pPr>
+      <w:r>
+        <w:t>– KPI 4. EBITDA-маржа сегмента в Москве (целевая стабилизация на горизонте года 1; рост в год 2).</w:t>
       </w:r>
     </w:p>
     <w:p>
@@ -7582,6 +7436,14 @@
         <w:jc w:val="both"/>
       </w:pPr>
       <w:r>
+        <w:t>Barney J. Firm Resources and Sustained Competitive Advantage // Journal of Management. 1991. Vol. 17, no. 1. P. 99–120. DOI: 10.1177/014920639101700108.</w:t>
+      </w:r>
+    </w:p>
+    <w:p>
+      <w:pPr>
+        <w:jc w:val="both"/>
+      </w:pPr>
+      <w:r>
         <w:t>Bobičić O., Esztergar-Kiss D. Enablers and barriers to micromobility adoption: Urban and suburban contexts // Sustainable Cities and Society. 2024. Vol. 111. Art. 105595. DOI: 10,1016/j.scs.2024,105595.</w:t>
       </w:r>
     </w:p>
@@ -7638,6 +7500,22 @@
         <w:jc w:val="both"/>
       </w:pPr>
       <w:r>
+        <w:t>Garus A., Dadashev G., Ciuffo B., Nahmias-Biran B. H. Urban Micromobility in Practice: Insights from a Full-Year Analysis of Shared Scooter Use in Tel Aviv // Smart Cities. 2025. Vol. 8, no. 6. Art. 207. DOI: 10,3390/smartcities8060207.</w:t>
+      </w:r>
+    </w:p>
+    <w:p>
+      <w:pPr>
+        <w:jc w:val="both"/>
+      </w:pPr>
+      <w:r>
+        <w:t>Groth S., Ahlmeyer F., Albrecht J., Gerten C., Klinger T., Novack T. Uneven development in market-based supplies of new micromobility services: The case of new e-scooter services // npj Sustainable Mobility and Transport. 2025. Vol. 2. Art. 41. DOI: 10,1038/s44333-025-00060-6.</w:t>
+      </w:r>
+    </w:p>
+    <w:p>
+      <w:pPr>
+        <w:jc w:val="both"/>
+      </w:pPr>
+      <w:r>
         <w:t>Gábor Š., Novotný L., Pregi L. Revealing Spatial Patterns of Dockless Shared Micromobility: A Case Study of Košice, Slovakia // Urban Science. 2025. Vol. 9, no. 4. Art. 107. DOI: 10,3390/urbansci9040107.</w:t>
       </w:r>
     </w:p>
@@ -7646,15 +7524,7 @@
         <w:jc w:val="both"/>
       </w:pPr>
       <w:r>
-        <w:t>Garus A., Dadashev G., Ciuffo B., Nahmias-Biran B. H. Urban Micromobility in Practice: Insights from a Full-Year Analysis of Shared Scooter Use in Tel Aviv // Smart Cities. 2025. Vol. 8, no. 6. Art. 207. DOI: 10,3390/smartcities8060207.</w:t>
-      </w:r>
-    </w:p>
-    <w:p>
-      <w:pPr>
-        <w:jc w:val="both"/>
-      </w:pPr>
-      <w:r>
-        <w:t>Groth S., Ahlmeyer F., Albrecht J., Gerten C., Klinger T., Novack T. Uneven development in market-based supplies of new micromobility services: The case of new e-scooter services // npj Sustainable Mobility and Transport. 2025. Vol. 2. Art. 41. DOI: 10,1038/s44333-025-00060-6.</w:t>
+        <w:t>Hollingsworth J., Copeland B., Johnson J. X. Are e-scooters polluters? The environmental impacts of shared dockless electric scooters // Environmental Research Letters. 2019. Vol. 14, no. 8. Art. 084031. DOI: 10.1088/1748-9326/ab2da8.</w:t>
       </w:r>
     </w:p>
     <w:p>
@@ -7670,6 +7540,14 @@
         <w:jc w:val="both"/>
       </w:pPr>
       <w:r>
+        <w:t>Johnson G., Whittington R., Scholes K., Angwin D., Regnér P. Exploring Strategy: Text and Cases. 11th ed. Harlow: Pearson, 2017. 832 p.</w:t>
+      </w:r>
+    </w:p>
+    <w:p>
+      <w:pPr>
+        <w:jc w:val="both"/>
+      </w:pPr>
+      <w:r>
         <w:t>Li A., Gao K., Zhao P., Axhausen K. W. Integrating shared e-scooters as the feeder to public transit: A comparative analysis of 124 European cities // Research in Transportation Economics. 2023. Vol. 99. Art. 101302. DOI: 10,1016/j.retrec.2023,101302.</w:t>
       </w:r>
     </w:p>
@@ -7702,6 +7580,14 @@
         <w:jc w:val="both"/>
       </w:pPr>
       <w:r>
+        <w:t>NACTO. Shared Micromobility in the U.S. and Canada: 2023 [Электронный ресурс]. New York: National Association of City Transportation Officials, 2024. URL: https://nacto.org/publication/shared-micromobility-report-2023/ (дата обращения: 19,02.2026).</w:t>
+      </w:r>
+    </w:p>
+    <w:p>
+      <w:pPr>
+        <w:jc w:val="both"/>
+      </w:pPr>
+      <w:r>
         <w:t>NACTO. Shared Micromobility in the U.S.: 2019 [Электронный ресурс]. New York: National Association of City Transportation Officials, 2020. URL: https://nacto.org/wp-content/uploads/2020bikesharesnapshot.pdf (дата обращения: 19,02.2026).</w:t>
       </w:r>
     </w:p>
@@ -7710,14 +7596,6 @@
         <w:jc w:val="both"/>
       </w:pPr>
       <w:r>
-        <w:t>NACTO. Shared Micromobility in the U.S. and Canada: 2023 [Электронный ресурс]. New York: National Association of City Transportation Officials, 2024. URL: https://nacto.org/publication/shared-micromobility-report-2023/ (дата обращения: 19,02.2026).</w:t>
-      </w:r>
-    </w:p>
-    <w:p>
-      <w:pPr>
-        <w:jc w:val="both"/>
-      </w:pPr>
-      <w:r>
         <w:t>POLIS Governance &amp; Integration Working Group. Careful What You Wish For: Practical Implications of Rules &amp; Requirements for Shared Micromobility [Электронный ресурс]. Brussels: POLIS, 2025. URL: https://www.polisnetwork.eu/wp-content/uploads/2025/03/Shared-Micromobility-Regulations-Report.pdf (дата обращения: 11,03.2026).</w:t>
       </w:r>
     </w:p>
@@ -7726,6 +7604,14 @@
         <w:jc w:val="both"/>
       </w:pPr>
       <w:r>
+        <w:t>Reed R., DeFillippi R. J. Causal Ambiguity, Barriers to Imitation, and Sustainable Competitive Advantage // Academy of Management Review. 1990. Vol. 15, no. 1. P. 88–102. DOI: 10.5465/amr.1990.4308277.</w:t>
+      </w:r>
+    </w:p>
+    <w:p>
+      <w:pPr>
+        <w:jc w:val="both"/>
+      </w:pPr>
+      <w:r>
         <w:t>Rietveld J., Schilling M. A. Platform Competition: A Systematic and Interdisciplinary Review of the Literature // Journal of Management. 2021. Vol. 47, no. 6. P. 1528–1563. DOI: 10,1177/0149206320969791.</w:t>
       </w:r>
     </w:p>
@@ -7750,6 +7636,14 @@
         <w:jc w:val="both"/>
       </w:pPr>
       <w:r>
+        <w:t>Teece D. J. Explicating Dynamic Capabilities: The Nature and Microfoundations of (Sustainable) Enterprise Performance // Strategic Management Journal. 2007. Vol. 28, no. 13. P. 1319–1350. DOI: 10.1002/smj.640.</w:t>
+      </w:r>
+    </w:p>
+    <w:p>
+      <w:pPr>
+        <w:jc w:val="both"/>
+      </w:pPr>
+      <w:r>
         <w:t>Teece D. J., Pisano G., Shuen A. Dynamic Capabilities and Strategic Management // Strategic Management Journal. 1997. Vol. 18, no. 7. P. 509–533. DOI: 10,1002/(SICI)1097-0266(199708)18:7&lt;509::AID-SMJ882&gt;3,0.CO;2-Z.</w:t>
       </w:r>
     </w:p>
@@ -7758,6 +7652,14 @@
         <w:jc w:val="both"/>
       </w:pPr>
       <w:r>
+        <w:t>Wernerfelt B. A Resource-Based View of the Firm // Strategic Management Journal. 1984. Vol. 5, no. 2. P. 171–180. DOI: 10.1002/smj.4250050207.</w:t>
+      </w:r>
+    </w:p>
+    <w:p>
+      <w:pPr>
+        <w:jc w:val="both"/>
+      </w:pPr>
+      <w:r>
         <w:t>Департамент транспорта и развития дорожно-транспортной инфраструктуры города Москвы. Новые правила для аренды электросамокатов начнут действовать в новом сезоне проката [Электронный ресурс]. 2025. 10 февр. URL: https://transport.mos.ru/mostrans/all_news/123241 (дата обращения: 26,02.2026).</w:t>
       </w:r>
     </w:p>
@@ -7767,6 +7669,22 @@
       </w:pPr>
       <w:r>
         <w:t>Иволгин А. В каких городах-миллионниках больше ездят на электросамокатах и сколько тратят самые активные пользователи [Электронный ресурс] // Т–Ж. 2024. 3 дек. URL: https://t-j.ru/kicksharing-stat/ (дата обращения: 27,02.2026).</w:t>
+      </w:r>
+    </w:p>
+    <w:p>
+      <w:pPr>
+        <w:jc w:val="both"/>
+      </w:pPr>
+      <w:r>
+        <w:t>Клейнер Г. Б. Системная экономика как платформа развития современной экономической теории // Вопросы экономики. 2013. № 6. С. 4–28.</w:t>
+      </w:r>
+    </w:p>
+    <w:p>
+      <w:pPr>
+        <w:jc w:val="both"/>
+      </w:pPr>
+      <w:r>
+        <w:t>Клейнер Г. Б. Системная экономика: шаги развития. М.: Научная библиотека, 2021. 624 с.</w:t>
       </w:r>
     </w:p>
     <w:p>
@@ -7899,37 +7817,7 @@
         <w:jc w:val="both"/>
       </w:pPr>
       <w:r>
-        <w:t>Используемые инструменты:</w:t>
-      </w:r>
-    </w:p>
-    <w:p>
-      <w:pPr>
-        <w:pStyle w:val="ListBullet"/>
-        <w:spacing w:line="360" w:lineRule="auto"/>
-        <w:ind w:firstLine="0" w:left="709"/>
-      </w:pPr>
-      <w:r>
-        <w:t>ChatGPT (OpenAI, модели GPT-4o, GPT-5) – большая языковая модель общего назначения;</w:t>
-      </w:r>
-    </w:p>
-    <w:p>
-      <w:pPr>
-        <w:pStyle w:val="ListBullet"/>
-        <w:spacing w:line="360" w:lineRule="auto"/>
-        <w:ind w:firstLine="0" w:left="709"/>
-      </w:pPr>
-      <w:r>
-        <w:t>Claude (Anthropic, модели Sonnet 4 и Opus 4) – большая языковая модель общего назначения;</w:t>
-      </w:r>
-    </w:p>
-    <w:p>
-      <w:pPr>
-        <w:pStyle w:val="ListBullet"/>
-        <w:spacing w:line="360" w:lineRule="auto"/>
-        <w:ind w:firstLine="0" w:left="709"/>
-      </w:pPr>
-      <w:r>
-        <w:t>веб-доступ через стандартные интерфейсы (chat.openai.com, claude.ai), а также интегрированные среды (Cursor IDE).</w:t>
+        <w:t>Используемые инструменты: ChatGPT (OpenAI, модели GPT-4o, GPT-5) и Claude (Anthropic, модели Sonnet 4 и Opus 4) — большие языковые модели общего назначения; доступ через стандартные веб-интерфейсы (chat.openai.com, claude.ai) и интегрированные среды (Cursor IDE).</w:t>
       </w:r>
     </w:p>
     <w:p>
@@ -7985,47 +7873,7 @@
         <w:jc w:val="both"/>
       </w:pPr>
       <w:r>
-        <w:t>Что НЕ передавалось инструментам ИИ и где их участие было исключено:</w:t>
-      </w:r>
-    </w:p>
-    <w:p>
-      <w:pPr>
-        <w:pStyle w:val="ListBullet"/>
-        <w:spacing w:line="360" w:lineRule="auto"/>
-        <w:ind w:firstLine="0" w:left="709"/>
-      </w:pPr>
-      <w:r>
-        <w:t>содержательные решения по постановке проблемы, выбору методологии, формулированию выводов и стратегического выбора;</w:t>
-      </w:r>
-    </w:p>
-    <w:p>
-      <w:pPr>
-        <w:pStyle w:val="ListBullet"/>
-        <w:spacing w:line="360" w:lineRule="auto"/>
-        <w:ind w:firstLine="0" w:left="709"/>
-      </w:pPr>
-      <w:r>
-        <w:t>интерпретация данных от эксперта А., материалов интервью и оригинальных научных публикаций;</w:t>
-      </w:r>
-    </w:p>
-    <w:p>
-      <w:pPr>
-        <w:pStyle w:val="ListBullet"/>
-        <w:spacing w:line="360" w:lineRule="auto"/>
-        <w:ind w:firstLine="0" w:left="709"/>
-      </w:pPr>
-      <w:r>
-        <w:t>стратегические решения по выбору сценария S3, режимам конкурентных действий R1–R3 и проектному инструменту УПС;</w:t>
-      </w:r>
-    </w:p>
-    <w:p>
-      <w:pPr>
-        <w:pStyle w:val="ListBullet"/>
-        <w:spacing w:line="360" w:lineRule="auto"/>
-        <w:ind w:firstLine="0" w:left="709"/>
-      </w:pPr>
-      <w:r>
-        <w:t>содержание Приложений с расшифровками интервью.</w:t>
+        <w:t>Что НЕ передавалось инструментам ИИ и где их участие было исключено: содержательные решения по постановке проблемы, выбору методологии и стратегического выбора; интерпретация данных от эксперта А., материалов интервью и оригинальных научных публикаций; стратегические решения по выбору сценария S3, режимам конкурентных действий R1–R3 и проектному инструменту УПС; содержание Приложений с расшифровками интервью.</w:t>
       </w:r>
     </w:p>
     <w:p>

</xml_diff>